<commit_message>
Week 5: RSA public key cryptography implementation
</commit_message>
<xml_diff>
--- a/BIT 4138; Advanced Cryptography logbook .docx
+++ b/BIT 4138; Advanced Cryptography logbook .docx
@@ -1754,6 +1754,353 @@
     <w:p>
       <w:r>
         <w:t>AES is a symmetric block cipher that encrypts data in fixed-size blocks using secure keys. The process involves key generation, encryption, and decryption. Key protection is critical, and challenges included padding, file handling, and maintaining encryption-decryption consistency.</w:t>
+      </w:r>
+    </w:p>
+    <w:p>
+      <w:r>
+        <w:t xml:space="preserve"> </w:t>
+      </w:r>
+    </w:p>
+    <w:p/>
+    <w:p>
+      <w:r>
+        <w:t>W</w:t>
+      </w:r>
+      <w:r>
+        <w:t>eek</w:t>
+      </w:r>
+      <w:r>
+        <w:t xml:space="preserve"> </w:t>
+      </w:r>
+      <w:proofErr w:type="gramStart"/>
+      <w:r>
+        <w:t>5 ;</w:t>
+      </w:r>
+      <w:proofErr w:type="gramEnd"/>
+      <w:r>
+        <w:t xml:space="preserve"> Public Key Cryptography (RSA)</w:t>
+      </w:r>
+    </w:p>
+    <w:p>
+      <w:r>
+        <w:t>Implementation of RSA Encryption</w:t>
+      </w:r>
+      <w:r>
+        <w:t xml:space="preserve"> and Key Management</w:t>
+      </w:r>
+    </w:p>
+    <w:p/>
+    <w:p>
+      <w:r>
+        <w:t xml:space="preserve">FIG 1; RSA key pair Generation </w:t>
+      </w:r>
+    </w:p>
+    <w:p>
+      <w:r>
+        <w:rPr>
+          <w:noProof/>
+        </w:rPr>
+        <w:lastRenderedPageBreak/>
+        <w:drawing>
+          <wp:inline distT="0" distB="0" distL="0" distR="0" wp14:anchorId="4AF78072" wp14:editId="7AB7E9A0">
+            <wp:extent cx="5943600" cy="3492500"/>
+            <wp:effectExtent l="0" t="0" r="0" b="0"/>
+            <wp:docPr id="1428224925" name="Picture 6"/>
+            <wp:cNvGraphicFramePr>
+              <a:graphicFrameLocks xmlns:a="http://schemas.openxmlformats.org/drawingml/2006/main" noChangeAspect="1"/>
+            </wp:cNvGraphicFramePr>
+            <a:graphic xmlns:a="http://schemas.openxmlformats.org/drawingml/2006/main">
+              <a:graphicData uri="http://schemas.openxmlformats.org/drawingml/2006/picture">
+                <pic:pic xmlns:pic="http://schemas.openxmlformats.org/drawingml/2006/picture">
+                  <pic:nvPicPr>
+                    <pic:cNvPr id="1428224925" name="Picture 1428224925"/>
+                    <pic:cNvPicPr/>
+                  </pic:nvPicPr>
+                  <pic:blipFill>
+                    <a:blip r:embed="rId29" cstate="print">
+                      <a:extLst>
+                        <a:ext uri="{28A0092B-C50C-407E-A947-70E740481C1C}">
+                          <a14:useLocalDpi xmlns:a14="http://schemas.microsoft.com/office/drawing/2010/main" val="0"/>
+                        </a:ext>
+                      </a:extLst>
+                    </a:blip>
+                    <a:stretch>
+                      <a:fillRect/>
+                    </a:stretch>
+                  </pic:blipFill>
+                  <pic:spPr>
+                    <a:xfrm>
+                      <a:off x="0" y="0"/>
+                      <a:ext cx="5943600" cy="3492500"/>
+                    </a:xfrm>
+                    <a:prstGeom prst="rect">
+                      <a:avLst/>
+                    </a:prstGeom>
+                  </pic:spPr>
+                </pic:pic>
+              </a:graphicData>
+            </a:graphic>
+          </wp:inline>
+        </w:drawing>
+      </w:r>
+      <w:r>
+        <w:t xml:space="preserve"> </w:t>
+      </w:r>
+      <w:r>
+        <w:t xml:space="preserve"> </w:t>
+      </w:r>
+    </w:p>
+    <w:p/>
+    <w:p>
+      <w:r>
+        <w:t xml:space="preserve">FIG </w:t>
+      </w:r>
+      <w:proofErr w:type="gramStart"/>
+      <w:r>
+        <w:t>2 ;</w:t>
+      </w:r>
+      <w:proofErr w:type="gramEnd"/>
+      <w:r>
+        <w:t xml:space="preserve"> Public Key Encryption Process </w:t>
+      </w:r>
+    </w:p>
+    <w:p>
+      <w:r>
+        <w:rPr>
+          <w:noProof/>
+        </w:rPr>
+        <w:drawing>
+          <wp:inline distT="0" distB="0" distL="0" distR="0" wp14:anchorId="2BA50509" wp14:editId="4A41ABD5">
+            <wp:extent cx="5943600" cy="3491230"/>
+            <wp:effectExtent l="0" t="0" r="0" b="0"/>
+            <wp:docPr id="700691109" name="Picture 7"/>
+            <wp:cNvGraphicFramePr>
+              <a:graphicFrameLocks xmlns:a="http://schemas.openxmlformats.org/drawingml/2006/main" noChangeAspect="1"/>
+            </wp:cNvGraphicFramePr>
+            <a:graphic xmlns:a="http://schemas.openxmlformats.org/drawingml/2006/main">
+              <a:graphicData uri="http://schemas.openxmlformats.org/drawingml/2006/picture">
+                <pic:pic xmlns:pic="http://schemas.openxmlformats.org/drawingml/2006/picture">
+                  <pic:nvPicPr>
+                    <pic:cNvPr id="700691109" name="Picture 700691109"/>
+                    <pic:cNvPicPr/>
+                  </pic:nvPicPr>
+                  <pic:blipFill>
+                    <a:blip r:embed="rId30" cstate="print">
+                      <a:extLst>
+                        <a:ext uri="{28A0092B-C50C-407E-A947-70E740481C1C}">
+                          <a14:useLocalDpi xmlns:a14="http://schemas.microsoft.com/office/drawing/2010/main" val="0"/>
+                        </a:ext>
+                      </a:extLst>
+                    </a:blip>
+                    <a:stretch>
+                      <a:fillRect/>
+                    </a:stretch>
+                  </pic:blipFill>
+                  <pic:spPr>
+                    <a:xfrm>
+                      <a:off x="0" y="0"/>
+                      <a:ext cx="5943600" cy="3491230"/>
+                    </a:xfrm>
+                    <a:prstGeom prst="rect">
+                      <a:avLst/>
+                    </a:prstGeom>
+                  </pic:spPr>
+                </pic:pic>
+              </a:graphicData>
+            </a:graphic>
+          </wp:inline>
+        </w:drawing>
+      </w:r>
+    </w:p>
+    <w:p/>
+    <w:p>
+      <w:r>
+        <w:lastRenderedPageBreak/>
+        <w:t xml:space="preserve">FIG </w:t>
+      </w:r>
+      <w:proofErr w:type="gramStart"/>
+      <w:r>
+        <w:t>3 ;</w:t>
+      </w:r>
+      <w:proofErr w:type="gramEnd"/>
+      <w:r>
+        <w:t xml:space="preserve"> </w:t>
+      </w:r>
+      <w:r>
+        <w:t xml:space="preserve">Private Key Decryption results </w:t>
+      </w:r>
+    </w:p>
+    <w:p>
+      <w:r>
+        <w:rPr>
+          <w:noProof/>
+        </w:rPr>
+        <w:drawing>
+          <wp:inline distT="0" distB="0" distL="0" distR="0" wp14:anchorId="67F68BF7" wp14:editId="65B97C69">
+            <wp:extent cx="5943600" cy="3467735"/>
+            <wp:effectExtent l="0" t="0" r="0" b="0"/>
+            <wp:docPr id="1103964017" name="Picture 8"/>
+            <wp:cNvGraphicFramePr>
+              <a:graphicFrameLocks xmlns:a="http://schemas.openxmlformats.org/drawingml/2006/main" noChangeAspect="1"/>
+            </wp:cNvGraphicFramePr>
+            <a:graphic xmlns:a="http://schemas.openxmlformats.org/drawingml/2006/main">
+              <a:graphicData uri="http://schemas.openxmlformats.org/drawingml/2006/picture">
+                <pic:pic xmlns:pic="http://schemas.openxmlformats.org/drawingml/2006/picture">
+                  <pic:nvPicPr>
+                    <pic:cNvPr id="1103964017" name="Picture 1103964017"/>
+                    <pic:cNvPicPr/>
+                  </pic:nvPicPr>
+                  <pic:blipFill>
+                    <a:blip r:embed="rId31" cstate="print">
+                      <a:extLst>
+                        <a:ext uri="{28A0092B-C50C-407E-A947-70E740481C1C}">
+                          <a14:useLocalDpi xmlns:a14="http://schemas.microsoft.com/office/drawing/2010/main" val="0"/>
+                        </a:ext>
+                      </a:extLst>
+                    </a:blip>
+                    <a:stretch>
+                      <a:fillRect/>
+                    </a:stretch>
+                  </pic:blipFill>
+                  <pic:spPr>
+                    <a:xfrm>
+                      <a:off x="0" y="0"/>
+                      <a:ext cx="5943600" cy="3467735"/>
+                    </a:xfrm>
+                    <a:prstGeom prst="rect">
+                      <a:avLst/>
+                    </a:prstGeom>
+                  </pic:spPr>
+                </pic:pic>
+              </a:graphicData>
+            </a:graphic>
+          </wp:inline>
+        </w:drawing>
+      </w:r>
+    </w:p>
+    <w:p/>
+    <w:p>
+      <w:r>
+        <w:t xml:space="preserve">FIG 4: Secure message transmission </w:t>
+      </w:r>
+    </w:p>
+    <w:p>
+      <w:r>
+        <w:rPr>
+          <w:noProof/>
+        </w:rPr>
+        <w:drawing>
+          <wp:inline distT="0" distB="0" distL="0" distR="0" wp14:anchorId="4D405875" wp14:editId="06002337">
+            <wp:extent cx="5943600" cy="3501390"/>
+            <wp:effectExtent l="0" t="0" r="0" b="3810"/>
+            <wp:docPr id="506288177" name="Picture 9"/>
+            <wp:cNvGraphicFramePr>
+              <a:graphicFrameLocks xmlns:a="http://schemas.openxmlformats.org/drawingml/2006/main" noChangeAspect="1"/>
+            </wp:cNvGraphicFramePr>
+            <a:graphic xmlns:a="http://schemas.openxmlformats.org/drawingml/2006/main">
+              <a:graphicData uri="http://schemas.openxmlformats.org/drawingml/2006/picture">
+                <pic:pic xmlns:pic="http://schemas.openxmlformats.org/drawingml/2006/picture">
+                  <pic:nvPicPr>
+                    <pic:cNvPr id="506288177" name="Picture 506288177"/>
+                    <pic:cNvPicPr/>
+                  </pic:nvPicPr>
+                  <pic:blipFill>
+                    <a:blip r:embed="rId32" cstate="print">
+                      <a:extLst>
+                        <a:ext uri="{28A0092B-C50C-407E-A947-70E740481C1C}">
+                          <a14:useLocalDpi xmlns:a14="http://schemas.microsoft.com/office/drawing/2010/main" val="0"/>
+                        </a:ext>
+                      </a:extLst>
+                    </a:blip>
+                    <a:stretch>
+                      <a:fillRect/>
+                    </a:stretch>
+                  </pic:blipFill>
+                  <pic:spPr>
+                    <a:xfrm>
+                      <a:off x="0" y="0"/>
+                      <a:ext cx="5943600" cy="3501390"/>
+                    </a:xfrm>
+                    <a:prstGeom prst="rect">
+                      <a:avLst/>
+                    </a:prstGeom>
+                  </pic:spPr>
+                </pic:pic>
+              </a:graphicData>
+            </a:graphic>
+          </wp:inline>
+        </w:drawing>
+      </w:r>
+    </w:p>
+    <w:p>
+      <w:r>
+        <w:lastRenderedPageBreak/>
+        <w:t xml:space="preserve">FIG </w:t>
+      </w:r>
+      <w:proofErr w:type="gramStart"/>
+      <w:r>
+        <w:t>5 ;</w:t>
+      </w:r>
+      <w:proofErr w:type="gramEnd"/>
+      <w:r>
+        <w:t xml:space="preserve"> </w:t>
+      </w:r>
+      <w:r>
+        <w:t xml:space="preserve">RSA Testing and Validation </w:t>
+      </w:r>
+    </w:p>
+    <w:p>
+      <w:r>
+        <w:rPr>
+          <w:noProof/>
+        </w:rPr>
+        <w:drawing>
+          <wp:inline distT="0" distB="0" distL="0" distR="0" wp14:anchorId="6C73052E" wp14:editId="666A815A">
+            <wp:extent cx="5943600" cy="3427095"/>
+            <wp:effectExtent l="0" t="0" r="0" b="1905"/>
+            <wp:docPr id="1790704015" name="Picture 10"/>
+            <wp:cNvGraphicFramePr>
+              <a:graphicFrameLocks xmlns:a="http://schemas.openxmlformats.org/drawingml/2006/main" noChangeAspect="1"/>
+            </wp:cNvGraphicFramePr>
+            <a:graphic xmlns:a="http://schemas.openxmlformats.org/drawingml/2006/main">
+              <a:graphicData uri="http://schemas.openxmlformats.org/drawingml/2006/picture">
+                <pic:pic xmlns:pic="http://schemas.openxmlformats.org/drawingml/2006/picture">
+                  <pic:nvPicPr>
+                    <pic:cNvPr id="1790704015" name="Picture 1790704015"/>
+                    <pic:cNvPicPr/>
+                  </pic:nvPicPr>
+                  <pic:blipFill>
+                    <a:blip r:embed="rId33" cstate="print">
+                      <a:extLst>
+                        <a:ext uri="{28A0092B-C50C-407E-A947-70E740481C1C}">
+                          <a14:useLocalDpi xmlns:a14="http://schemas.microsoft.com/office/drawing/2010/main" val="0"/>
+                        </a:ext>
+                      </a:extLst>
+                    </a:blip>
+                    <a:stretch>
+                      <a:fillRect/>
+                    </a:stretch>
+                  </pic:blipFill>
+                  <pic:spPr>
+                    <a:xfrm>
+                      <a:off x="0" y="0"/>
+                      <a:ext cx="5943600" cy="3427095"/>
+                    </a:xfrm>
+                    <a:prstGeom prst="rect">
+                      <a:avLst/>
+                    </a:prstGeom>
+                  </pic:spPr>
+                </pic:pic>
+              </a:graphicData>
+            </a:graphic>
+          </wp:inline>
+        </w:drawing>
+      </w:r>
+    </w:p>
+    <w:p/>
+    <w:p>
+      <w:r>
+        <w:t>RSA enables asymmetric encryption using a public key for encryption and a private key for decryption. This ensures secure communication without sharing secret keys. The workflow includes key generation, encryption, and decryption. Testing confirmed correct message recovery and validated RSA security principles.</w:t>
       </w:r>
     </w:p>
     <w:p/>

</xml_diff>

<commit_message>
Completed Week 6 SPN Cryptography Project
</commit_message>
<xml_diff>
--- a/BIT 4138; Advanced Cryptography logbook .docx
+++ b/BIT 4138; Advanced Cryptography logbook .docx
@@ -88,7 +88,7 @@
                     <pic:cNvPicPr/>
                   </pic:nvPicPr>
                   <pic:blipFill>
-                    <a:blip r:embed="rId4">
+                    <a:blip r:embed="rId5">
                       <a:extLst>
                         <a:ext uri="{28A0092B-C50C-407E-A947-70E740481C1C}">
                           <a14:useLocalDpi xmlns:a14="http://schemas.microsoft.com/office/drawing/2010/main" val="0"/>
@@ -173,7 +173,7 @@
                     <pic:cNvPicPr/>
                   </pic:nvPicPr>
                   <pic:blipFill>
-                    <a:blip r:embed="rId5" cstate="print">
+                    <a:blip r:embed="rId6" cstate="print">
                       <a:extLst>
                         <a:ext uri="{28A0092B-C50C-407E-A947-70E740481C1C}">
                           <a14:useLocalDpi xmlns:a14="http://schemas.microsoft.com/office/drawing/2010/main" val="0"/>
@@ -235,7 +235,7 @@
                     <pic:cNvPicPr/>
                   </pic:nvPicPr>
                   <pic:blipFill>
-                    <a:blip r:embed="rId6">
+                    <a:blip r:embed="rId7">
                       <a:extLst>
                         <a:ext uri="{28A0092B-C50C-407E-A947-70E740481C1C}">
                           <a14:useLocalDpi xmlns:a14="http://schemas.microsoft.com/office/drawing/2010/main" val="0"/>
@@ -305,7 +305,7 @@
                     <pic:cNvPicPr/>
                   </pic:nvPicPr>
                   <pic:blipFill>
-                    <a:blip r:embed="rId7">
+                    <a:blip r:embed="rId8">
                       <a:extLst>
                         <a:ext uri="{28A0092B-C50C-407E-A947-70E740481C1C}">
                           <a14:useLocalDpi xmlns:a14="http://schemas.microsoft.com/office/drawing/2010/main" val="0"/>
@@ -372,7 +372,7 @@
                     <pic:cNvPicPr/>
                   </pic:nvPicPr>
                   <pic:blipFill>
-                    <a:blip r:embed="rId8">
+                    <a:blip r:embed="rId9">
                       <a:extLst>
                         <a:ext uri="{28A0092B-C50C-407E-A947-70E740481C1C}">
                           <a14:useLocalDpi xmlns:a14="http://schemas.microsoft.com/office/drawing/2010/main" val="0"/>
@@ -428,7 +428,7 @@
           <w:noProof/>
         </w:rPr>
         <w:drawing>
-          <wp:inline distT="0" distB="0" distL="0" distR="0" wp14:anchorId="36EAD0D3" wp14:editId="42AA37A3">
+          <wp:inline distT="0" distB="0" distL="0" distR="0" wp14:anchorId="36EAD0D3" wp14:editId="5D0C6D62">
             <wp:extent cx="5943600" cy="2475230"/>
             <wp:effectExtent l="0" t="0" r="0" b="1270"/>
             <wp:docPr id="1452666835" name="Picture 1"/>
@@ -443,7 +443,7 @@
                     <pic:cNvPicPr/>
                   </pic:nvPicPr>
                   <pic:blipFill>
-                    <a:blip r:embed="rId9" cstate="print">
+                    <a:blip r:embed="rId10" cstate="print">
                       <a:extLst>
                         <a:ext uri="{28A0092B-C50C-407E-A947-70E740481C1C}">
                           <a14:useLocalDpi xmlns:a14="http://schemas.microsoft.com/office/drawing/2010/main" val="0"/>
@@ -512,7 +512,7 @@
           <w:noProof/>
         </w:rPr>
         <w:drawing>
-          <wp:inline distT="0" distB="0" distL="0" distR="0" wp14:anchorId="57BBA710" wp14:editId="6047EF0A">
+          <wp:inline distT="0" distB="0" distL="0" distR="0" wp14:anchorId="57BBA710" wp14:editId="546FB8AB">
             <wp:extent cx="5943600" cy="3225800"/>
             <wp:effectExtent l="0" t="0" r="0" b="0"/>
             <wp:docPr id="1146746702" name="Picture 1"/>
@@ -527,7 +527,7 @@
                     <pic:cNvPicPr/>
                   </pic:nvPicPr>
                   <pic:blipFill>
-                    <a:blip r:embed="rId10" cstate="print">
+                    <a:blip r:embed="rId11" cstate="print">
                       <a:extLst>
                         <a:ext uri="{28A0092B-C50C-407E-A947-70E740481C1C}">
                           <a14:useLocalDpi xmlns:a14="http://schemas.microsoft.com/office/drawing/2010/main" val="0"/>
@@ -590,7 +590,7 @@
                     <pic:cNvPicPr/>
                   </pic:nvPicPr>
                   <pic:blipFill>
-                    <a:blip r:embed="rId11">
+                    <a:blip r:embed="rId12">
                       <a:extLst>
                         <a:ext uri="{28A0092B-C50C-407E-A947-70E740481C1C}">
                           <a14:useLocalDpi xmlns:a14="http://schemas.microsoft.com/office/drawing/2010/main" val="0"/>
@@ -642,7 +642,7 @@
                     <pic:cNvPicPr/>
                   </pic:nvPicPr>
                   <pic:blipFill>
-                    <a:blip r:embed="rId12">
+                    <a:blip r:embed="rId13">
                       <a:extLst>
                         <a:ext uri="{28A0092B-C50C-407E-A947-70E740481C1C}">
                           <a14:useLocalDpi xmlns:a14="http://schemas.microsoft.com/office/drawing/2010/main" val="0"/>
@@ -706,7 +706,7 @@
                     <pic:cNvPicPr/>
                   </pic:nvPicPr>
                   <pic:blipFill>
-                    <a:blip r:embed="rId13">
+                    <a:blip r:embed="rId14">
                       <a:extLst>
                         <a:ext uri="{28A0092B-C50C-407E-A947-70E740481C1C}">
                           <a14:useLocalDpi xmlns:a14="http://schemas.microsoft.com/office/drawing/2010/main" val="0"/>
@@ -754,7 +754,7 @@
                     <pic:cNvPicPr/>
                   </pic:nvPicPr>
                   <pic:blipFill>
-                    <a:blip r:embed="rId14">
+                    <a:blip r:embed="rId15">
                       <a:extLst>
                         <a:ext uri="{28A0092B-C50C-407E-A947-70E740481C1C}">
                           <a14:useLocalDpi xmlns:a14="http://schemas.microsoft.com/office/drawing/2010/main" val="0"/>
@@ -814,7 +814,7 @@
                     <pic:cNvPicPr/>
                   </pic:nvPicPr>
                   <pic:blipFill>
-                    <a:blip r:embed="rId15">
+                    <a:blip r:embed="rId16">
                       <a:extLst>
                         <a:ext uri="{28A0092B-C50C-407E-A947-70E740481C1C}">
                           <a14:useLocalDpi xmlns:a14="http://schemas.microsoft.com/office/drawing/2010/main" val="0"/>
@@ -866,7 +866,7 @@
                     <pic:cNvPicPr/>
                   </pic:nvPicPr>
                   <pic:blipFill>
-                    <a:blip r:embed="rId16">
+                    <a:blip r:embed="rId17">
                       <a:extLst>
                         <a:ext uri="{28A0092B-C50C-407E-A947-70E740481C1C}">
                           <a14:useLocalDpi xmlns:a14="http://schemas.microsoft.com/office/drawing/2010/main" val="0"/>
@@ -935,7 +935,7 @@
                     <pic:cNvPicPr/>
                   </pic:nvPicPr>
                   <pic:blipFill>
-                    <a:blip r:embed="rId17">
+                    <a:blip r:embed="rId18">
                       <a:extLst>
                         <a:ext uri="{28A0092B-C50C-407E-A947-70E740481C1C}">
                           <a14:useLocalDpi xmlns:a14="http://schemas.microsoft.com/office/drawing/2010/main" val="0"/>
@@ -983,7 +983,7 @@
                     <pic:cNvPicPr/>
                   </pic:nvPicPr>
                   <pic:blipFill>
-                    <a:blip r:embed="rId18" cstate="print">
+                    <a:blip r:embed="rId19" cstate="print">
                       <a:extLst>
                         <a:ext uri="{28A0092B-C50C-407E-A947-70E740481C1C}">
                           <a14:useLocalDpi xmlns:a14="http://schemas.microsoft.com/office/drawing/2010/main" val="0"/>
@@ -1077,7 +1077,7 @@
                     <pic:cNvPicPr/>
                   </pic:nvPicPr>
                   <pic:blipFill>
-                    <a:blip r:embed="rId19" cstate="print">
+                    <a:blip r:embed="rId20" cstate="print">
                       <a:extLst>
                         <a:ext uri="{28A0092B-C50C-407E-A947-70E740481C1C}">
                           <a14:useLocalDpi xmlns:a14="http://schemas.microsoft.com/office/drawing/2010/main" val="0"/>
@@ -1148,7 +1148,7 @@
                     <pic:cNvPicPr/>
                   </pic:nvPicPr>
                   <pic:blipFill>
-                    <a:blip r:embed="rId20">
+                    <a:blip r:embed="rId21">
                       <a:extLst>
                         <a:ext uri="{28A0092B-C50C-407E-A947-70E740481C1C}">
                           <a14:useLocalDpi xmlns:a14="http://schemas.microsoft.com/office/drawing/2010/main" val="0"/>
@@ -1187,7 +1187,7 @@
           <w:noProof/>
         </w:rPr>
         <w:drawing>
-          <wp:inline distT="0" distB="0" distL="0" distR="0" wp14:anchorId="3D247868" wp14:editId="5DF021A7">
+          <wp:inline distT="0" distB="0" distL="0" distR="0" wp14:anchorId="3D247868" wp14:editId="1922504F">
             <wp:extent cx="5943600" cy="2558415"/>
             <wp:effectExtent l="0" t="0" r="0" b="0"/>
             <wp:docPr id="2108466837" name="Picture 3"/>
@@ -1202,7 +1202,7 @@
                     <pic:cNvPicPr/>
                   </pic:nvPicPr>
                   <pic:blipFill>
-                    <a:blip r:embed="rId21" cstate="print">
+                    <a:blip r:embed="rId22" cstate="print">
                       <a:extLst>
                         <a:ext uri="{28A0092B-C50C-407E-A947-70E740481C1C}">
                           <a14:useLocalDpi xmlns:a14="http://schemas.microsoft.com/office/drawing/2010/main" val="0"/>
@@ -1236,7 +1236,7 @@
         </w:rPr>
         <w:lastRenderedPageBreak/>
         <w:drawing>
-          <wp:inline distT="0" distB="0" distL="0" distR="0" wp14:anchorId="2DCF80EA" wp14:editId="63841A41">
+          <wp:inline distT="0" distB="0" distL="0" distR="0" wp14:anchorId="2DCF80EA" wp14:editId="45EFBC94">
             <wp:extent cx="5943600" cy="943610"/>
             <wp:effectExtent l="0" t="0" r="0" b="8890"/>
             <wp:docPr id="2119086713" name="Picture 4"/>
@@ -1251,7 +1251,7 @@
                     <pic:cNvPicPr/>
                   </pic:nvPicPr>
                   <pic:blipFill>
-                    <a:blip r:embed="rId22" cstate="print">
+                    <a:blip r:embed="rId23" cstate="print">
                       <a:extLst>
                         <a:ext uri="{28A0092B-C50C-407E-A947-70E740481C1C}">
                           <a14:useLocalDpi xmlns:a14="http://schemas.microsoft.com/office/drawing/2010/main" val="0"/>
@@ -1301,7 +1301,7 @@
           <w:noProof/>
         </w:rPr>
         <w:drawing>
-          <wp:inline distT="0" distB="0" distL="0" distR="0" wp14:anchorId="3A8C0AC1" wp14:editId="1EACBAB9">
+          <wp:inline distT="0" distB="0" distL="0" distR="0" wp14:anchorId="3A8C0AC1" wp14:editId="65A3548E">
             <wp:extent cx="5943600" cy="3324225"/>
             <wp:effectExtent l="0" t="0" r="0" b="9525"/>
             <wp:docPr id="264846924" name="Picture 5"/>
@@ -1316,7 +1316,7 @@
                     <pic:cNvPicPr/>
                   </pic:nvPicPr>
                   <pic:blipFill>
-                    <a:blip r:embed="rId23" cstate="print">
+                    <a:blip r:embed="rId24" cstate="print">
                       <a:extLst>
                         <a:ext uri="{28A0092B-C50C-407E-A947-70E740481C1C}">
                           <a14:useLocalDpi xmlns:a14="http://schemas.microsoft.com/office/drawing/2010/main" val="0"/>
@@ -1364,7 +1364,7 @@
         </w:rPr>
         <w:lastRenderedPageBreak/>
         <w:drawing>
-          <wp:inline distT="0" distB="0" distL="0" distR="0" wp14:anchorId="52DA3A8C" wp14:editId="77E170AE">
+          <wp:inline distT="0" distB="0" distL="0" distR="0" wp14:anchorId="52DA3A8C" wp14:editId="6445D258">
             <wp:extent cx="5943600" cy="3356610"/>
             <wp:effectExtent l="0" t="0" r="0" b="0"/>
             <wp:docPr id="1084858864" name="Picture 6"/>
@@ -1379,7 +1379,7 @@
                     <pic:cNvPicPr/>
                   </pic:nvPicPr>
                   <pic:blipFill>
-                    <a:blip r:embed="rId24" cstate="print">
+                    <a:blip r:embed="rId25" cstate="print">
                       <a:extLst>
                         <a:ext uri="{28A0092B-C50C-407E-A947-70E740481C1C}">
                           <a14:useLocalDpi xmlns:a14="http://schemas.microsoft.com/office/drawing/2010/main" val="0"/>
@@ -1449,7 +1449,7 @@
           <w:noProof/>
         </w:rPr>
         <w:drawing>
-          <wp:inline distT="0" distB="0" distL="0" distR="0" wp14:anchorId="270AF4D1" wp14:editId="0558167F">
+          <wp:inline distT="0" distB="0" distL="0" distR="0" wp14:anchorId="270AF4D1" wp14:editId="56ED2F8B">
             <wp:extent cx="5943600" cy="3446145"/>
             <wp:effectExtent l="0" t="0" r="0" b="1905"/>
             <wp:docPr id="1187196502" name="Picture 2"/>
@@ -1464,7 +1464,7 @@
                     <pic:cNvPicPr/>
                   </pic:nvPicPr>
                   <pic:blipFill>
-                    <a:blip r:embed="rId25" cstate="print">
+                    <a:blip r:embed="rId26" cstate="print">
                       <a:extLst>
                         <a:ext uri="{28A0092B-C50C-407E-A947-70E740481C1C}">
                           <a14:useLocalDpi xmlns:a14="http://schemas.microsoft.com/office/drawing/2010/main" val="0"/>
@@ -1516,7 +1516,7 @@
         </w:rPr>
         <w:lastRenderedPageBreak/>
         <w:drawing>
-          <wp:inline distT="0" distB="0" distL="0" distR="0" wp14:anchorId="1D2200AA" wp14:editId="43251611">
+          <wp:inline distT="0" distB="0" distL="0" distR="0" wp14:anchorId="1D2200AA" wp14:editId="4DEEA2ED">
             <wp:extent cx="5943600" cy="3434080"/>
             <wp:effectExtent l="0" t="0" r="0" b="0"/>
             <wp:docPr id="262425837" name="Picture 1"/>
@@ -1531,7 +1531,7 @@
                     <pic:cNvPicPr/>
                   </pic:nvPicPr>
                   <pic:blipFill>
-                    <a:blip r:embed="rId26" cstate="print">
+                    <a:blip r:embed="rId27" cstate="print">
                       <a:extLst>
                         <a:ext uri="{28A0092B-C50C-407E-A947-70E740481C1C}">
                           <a14:useLocalDpi xmlns:a14="http://schemas.microsoft.com/office/drawing/2010/main" val="0"/>
@@ -1580,7 +1580,7 @@
           <w:noProof/>
         </w:rPr>
         <w:drawing>
-          <wp:inline distT="0" distB="0" distL="0" distR="0" wp14:anchorId="6608050A" wp14:editId="70363A4C">
+          <wp:inline distT="0" distB="0" distL="0" distR="0" wp14:anchorId="6608050A" wp14:editId="6639AEAA">
             <wp:extent cx="5943600" cy="3446145"/>
             <wp:effectExtent l="0" t="0" r="0" b="1905"/>
             <wp:docPr id="1469873442" name="Picture 3"/>
@@ -1595,7 +1595,7 @@
                     <pic:cNvPicPr/>
                   </pic:nvPicPr>
                   <pic:blipFill>
-                    <a:blip r:embed="rId25" cstate="print">
+                    <a:blip r:embed="rId26" cstate="print">
                       <a:extLst>
                         <a:ext uri="{28A0092B-C50C-407E-A947-70E740481C1C}">
                           <a14:useLocalDpi xmlns:a14="http://schemas.microsoft.com/office/drawing/2010/main" val="0"/>
@@ -1641,7 +1641,7 @@
           <w:noProof/>
         </w:rPr>
         <w:drawing>
-          <wp:inline distT="0" distB="0" distL="0" distR="0" wp14:anchorId="0D50EFCB" wp14:editId="0AA91C70">
+          <wp:inline distT="0" distB="0" distL="0" distR="0" wp14:anchorId="0D50EFCB" wp14:editId="02508637">
             <wp:extent cx="5943600" cy="3256915"/>
             <wp:effectExtent l="0" t="0" r="0" b="635"/>
             <wp:docPr id="1143204175" name="Picture 4"/>
@@ -1656,7 +1656,7 @@
                     <pic:cNvPicPr/>
                   </pic:nvPicPr>
                   <pic:blipFill>
-                    <a:blip r:embed="rId27" cstate="print">
+                    <a:blip r:embed="rId28" cstate="print">
                       <a:extLst>
                         <a:ext uri="{28A0092B-C50C-407E-A947-70E740481C1C}">
                           <a14:useLocalDpi xmlns:a14="http://schemas.microsoft.com/office/drawing/2010/main" val="0"/>
@@ -1708,7 +1708,7 @@
         </w:rPr>
         <w:lastRenderedPageBreak/>
         <w:drawing>
-          <wp:inline distT="0" distB="0" distL="0" distR="0" wp14:anchorId="34D74F7F" wp14:editId="378066A3">
+          <wp:inline distT="0" distB="0" distL="0" distR="0" wp14:anchorId="34D74F7F" wp14:editId="672E9D2C">
             <wp:extent cx="5943600" cy="3298190"/>
             <wp:effectExtent l="0" t="0" r="0" b="0"/>
             <wp:docPr id="474399364" name="Picture 5"/>
@@ -1723,7 +1723,7 @@
                     <pic:cNvPicPr/>
                   </pic:nvPicPr>
                   <pic:blipFill>
-                    <a:blip r:embed="rId28" cstate="print">
+                    <a:blip r:embed="rId29" cstate="print">
                       <a:extLst>
                         <a:ext uri="{28A0092B-C50C-407E-A947-70E740481C1C}">
                           <a14:useLocalDpi xmlns:a14="http://schemas.microsoft.com/office/drawing/2010/main" val="0"/>
@@ -1802,7 +1802,7 @@
         </w:rPr>
         <w:lastRenderedPageBreak/>
         <w:drawing>
-          <wp:inline distT="0" distB="0" distL="0" distR="0" wp14:anchorId="4AF78072" wp14:editId="7AB7E9A0">
+          <wp:inline distT="0" distB="0" distL="0" distR="0" wp14:anchorId="4AF78072" wp14:editId="1867F4FF">
             <wp:extent cx="5943600" cy="3492500"/>
             <wp:effectExtent l="0" t="0" r="0" b="0"/>
             <wp:docPr id="1428224925" name="Picture 6"/>
@@ -1817,7 +1817,7 @@
                     <pic:cNvPicPr/>
                   </pic:nvPicPr>
                   <pic:blipFill>
-                    <a:blip r:embed="rId29" cstate="print">
+                    <a:blip r:embed="rId30" cstate="print">
                       <a:extLst>
                         <a:ext uri="{28A0092B-C50C-407E-A947-70E740481C1C}">
                           <a14:useLocalDpi xmlns:a14="http://schemas.microsoft.com/office/drawing/2010/main" val="0"/>
@@ -1870,7 +1870,7 @@
           <w:noProof/>
         </w:rPr>
         <w:drawing>
-          <wp:inline distT="0" distB="0" distL="0" distR="0" wp14:anchorId="2BA50509" wp14:editId="4A41ABD5">
+          <wp:inline distT="0" distB="0" distL="0" distR="0" wp14:anchorId="2BA50509" wp14:editId="35B268B7">
             <wp:extent cx="5943600" cy="3491230"/>
             <wp:effectExtent l="0" t="0" r="0" b="0"/>
             <wp:docPr id="700691109" name="Picture 7"/>
@@ -1885,7 +1885,7 @@
                     <pic:cNvPicPr/>
                   </pic:nvPicPr>
                   <pic:blipFill>
-                    <a:blip r:embed="rId30" cstate="print">
+                    <a:blip r:embed="rId31" cstate="print">
                       <a:extLst>
                         <a:ext uri="{28A0092B-C50C-407E-A947-70E740481C1C}">
                           <a14:useLocalDpi xmlns:a14="http://schemas.microsoft.com/office/drawing/2010/main" val="0"/>
@@ -1936,7 +1936,7 @@
           <w:noProof/>
         </w:rPr>
         <w:drawing>
-          <wp:inline distT="0" distB="0" distL="0" distR="0" wp14:anchorId="67F68BF7" wp14:editId="65B97C69">
+          <wp:inline distT="0" distB="0" distL="0" distR="0" wp14:anchorId="67F68BF7" wp14:editId="2B24969A">
             <wp:extent cx="5943600" cy="3467735"/>
             <wp:effectExtent l="0" t="0" r="0" b="0"/>
             <wp:docPr id="1103964017" name="Picture 8"/>
@@ -1951,7 +1951,7 @@
                     <pic:cNvPicPr/>
                   </pic:nvPicPr>
                   <pic:blipFill>
-                    <a:blip r:embed="rId31" cstate="print">
+                    <a:blip r:embed="rId32" cstate="print">
                       <a:extLst>
                         <a:ext uri="{28A0092B-C50C-407E-A947-70E740481C1C}">
                           <a14:useLocalDpi xmlns:a14="http://schemas.microsoft.com/office/drawing/2010/main" val="0"/>
@@ -1990,7 +1990,7 @@
           <w:noProof/>
         </w:rPr>
         <w:drawing>
-          <wp:inline distT="0" distB="0" distL="0" distR="0" wp14:anchorId="4D405875" wp14:editId="06002337">
+          <wp:inline distT="0" distB="0" distL="0" distR="0" wp14:anchorId="4D405875" wp14:editId="5C32FD19">
             <wp:extent cx="5943600" cy="3501390"/>
             <wp:effectExtent l="0" t="0" r="0" b="3810"/>
             <wp:docPr id="506288177" name="Picture 9"/>
@@ -2005,7 +2005,7 @@
                     <pic:cNvPicPr/>
                   </pic:nvPicPr>
                   <pic:blipFill>
-                    <a:blip r:embed="rId32" cstate="print">
+                    <a:blip r:embed="rId33" cstate="print">
                       <a:extLst>
                         <a:ext uri="{28A0092B-C50C-407E-A947-70E740481C1C}">
                           <a14:useLocalDpi xmlns:a14="http://schemas.microsoft.com/office/drawing/2010/main" val="0"/>
@@ -2055,7 +2055,7 @@
           <w:noProof/>
         </w:rPr>
         <w:drawing>
-          <wp:inline distT="0" distB="0" distL="0" distR="0" wp14:anchorId="6C73052E" wp14:editId="666A815A">
+          <wp:inline distT="0" distB="0" distL="0" distR="0" wp14:anchorId="6C73052E" wp14:editId="0B050F92">
             <wp:extent cx="5943600" cy="3427095"/>
             <wp:effectExtent l="0" t="0" r="0" b="1905"/>
             <wp:docPr id="1790704015" name="Picture 10"/>
@@ -2070,7 +2070,7 @@
                     <pic:cNvPicPr/>
                   </pic:nvPicPr>
                   <pic:blipFill>
-                    <a:blip r:embed="rId33" cstate="print">
+                    <a:blip r:embed="rId34" cstate="print">
                       <a:extLst>
                         <a:ext uri="{28A0092B-C50C-407E-A947-70E740481C1C}">
                           <a14:useLocalDpi xmlns:a14="http://schemas.microsoft.com/office/drawing/2010/main" val="0"/>
@@ -2104,6 +2104,2174 @@
       </w:r>
     </w:p>
     <w:p/>
+    <w:p/>
+    <w:p>
+      <w:r>
+        <w:t>Week 6: Symmetric Ciphers II – SPN, S-Boxes and Non-</w:t>
+      </w:r>
+      <w:proofErr w:type="spellStart"/>
+      <w:r>
+        <w:t>Linearity</w:t>
+      </w:r>
+      <w:proofErr w:type="spellEnd"/>
+    </w:p>
+    <w:p>
+      <w:r>
+        <w:t xml:space="preserve">FIG </w:t>
+      </w:r>
+      <w:proofErr w:type="gramStart"/>
+      <w:r>
+        <w:t>1 ;</w:t>
+      </w:r>
+      <w:proofErr w:type="gramEnd"/>
+      <w:r>
+        <w:t xml:space="preserve"> </w:t>
+      </w:r>
+      <w:r>
+        <w:t>USER INPUT SCREEN</w:t>
+      </w:r>
+    </w:p>
+    <w:p>
+      <w:r>
+        <w:rPr>
+          <w:noProof/>
+        </w:rPr>
+        <w:lastRenderedPageBreak/>
+        <w:drawing>
+          <wp:inline distT="0" distB="0" distL="0" distR="0" wp14:anchorId="6049FE3C" wp14:editId="7406E71E">
+            <wp:extent cx="5943600" cy="4264025"/>
+            <wp:effectExtent l="0" t="0" r="0" b="3175"/>
+            <wp:docPr id="1620016671" name="Picture 1"/>
+            <wp:cNvGraphicFramePr>
+              <a:graphicFrameLocks xmlns:a="http://schemas.openxmlformats.org/drawingml/2006/main" noChangeAspect="1"/>
+            </wp:cNvGraphicFramePr>
+            <a:graphic xmlns:a="http://schemas.openxmlformats.org/drawingml/2006/main">
+              <a:graphicData uri="http://schemas.openxmlformats.org/drawingml/2006/picture">
+                <pic:pic xmlns:pic="http://schemas.openxmlformats.org/drawingml/2006/picture">
+                  <pic:nvPicPr>
+                    <pic:cNvPr id="1620016671" name="Picture 1620016671"/>
+                    <pic:cNvPicPr/>
+                  </pic:nvPicPr>
+                  <pic:blipFill>
+                    <a:blip r:embed="rId35">
+                      <a:extLst>
+                        <a:ext uri="{28A0092B-C50C-407E-A947-70E740481C1C}">
+                          <a14:useLocalDpi xmlns:a14="http://schemas.microsoft.com/office/drawing/2010/main" val="0"/>
+                        </a:ext>
+                      </a:extLst>
+                    </a:blip>
+                    <a:stretch>
+                      <a:fillRect/>
+                    </a:stretch>
+                  </pic:blipFill>
+                  <pic:spPr>
+                    <a:xfrm>
+                      <a:off x="0" y="0"/>
+                      <a:ext cx="5943600" cy="4264025"/>
+                    </a:xfrm>
+                    <a:prstGeom prst="rect">
+                      <a:avLst/>
+                    </a:prstGeom>
+                  </pic:spPr>
+                </pic:pic>
+              </a:graphicData>
+            </a:graphic>
+          </wp:inline>
+        </w:drawing>
+      </w:r>
+    </w:p>
+    <w:p/>
+    <w:p>
+      <w:r>
+        <w:t>FIG 2: KEY MIXING OUTPUT</w:t>
+      </w:r>
+    </w:p>
+    <w:p>
+      <w:r>
+        <w:rPr>
+          <w:noProof/>
+        </w:rPr>
+        <w:lastRenderedPageBreak/>
+        <w:drawing>
+          <wp:inline distT="0" distB="0" distL="0" distR="0" wp14:anchorId="5E633F7E" wp14:editId="74F37EB4">
+            <wp:extent cx="5943600" cy="3460115"/>
+            <wp:effectExtent l="0" t="0" r="0" b="6985"/>
+            <wp:docPr id="463777567" name="Picture 2"/>
+            <wp:cNvGraphicFramePr>
+              <a:graphicFrameLocks xmlns:a="http://schemas.openxmlformats.org/drawingml/2006/main" noChangeAspect="1"/>
+            </wp:cNvGraphicFramePr>
+            <a:graphic xmlns:a="http://schemas.openxmlformats.org/drawingml/2006/main">
+              <a:graphicData uri="http://schemas.openxmlformats.org/drawingml/2006/picture">
+                <pic:pic xmlns:pic="http://schemas.openxmlformats.org/drawingml/2006/picture">
+                  <pic:nvPicPr>
+                    <pic:cNvPr id="463777567" name="Picture 463777567"/>
+                    <pic:cNvPicPr/>
+                  </pic:nvPicPr>
+                  <pic:blipFill>
+                    <a:blip r:embed="rId36" cstate="print">
+                      <a:extLst>
+                        <a:ext uri="{28A0092B-C50C-407E-A947-70E740481C1C}">
+                          <a14:useLocalDpi xmlns:a14="http://schemas.microsoft.com/office/drawing/2010/main" val="0"/>
+                        </a:ext>
+                      </a:extLst>
+                    </a:blip>
+                    <a:stretch>
+                      <a:fillRect/>
+                    </a:stretch>
+                  </pic:blipFill>
+                  <pic:spPr>
+                    <a:xfrm>
+                      <a:off x="0" y="0"/>
+                      <a:ext cx="5943600" cy="3460115"/>
+                    </a:xfrm>
+                    <a:prstGeom prst="rect">
+                      <a:avLst/>
+                    </a:prstGeom>
+                  </pic:spPr>
+                </pic:pic>
+              </a:graphicData>
+            </a:graphic>
+          </wp:inline>
+        </w:drawing>
+      </w:r>
+    </w:p>
+    <w:p/>
+    <w:p>
+      <w:r>
+        <w:t>FIG 3: SUBSTITUTION OUTPUT</w:t>
+      </w:r>
+    </w:p>
+    <w:p>
+      <w:r>
+        <w:rPr>
+          <w:noProof/>
+        </w:rPr>
+        <w:drawing>
+          <wp:inline distT="0" distB="0" distL="0" distR="0" wp14:anchorId="4A099CA5" wp14:editId="2CB40885">
+            <wp:extent cx="5943600" cy="3460115"/>
+            <wp:effectExtent l="0" t="0" r="0" b="6985"/>
+            <wp:docPr id="1103997415" name="Picture 3"/>
+            <wp:cNvGraphicFramePr>
+              <a:graphicFrameLocks xmlns:a="http://schemas.openxmlformats.org/drawingml/2006/main" noChangeAspect="1"/>
+            </wp:cNvGraphicFramePr>
+            <a:graphic xmlns:a="http://schemas.openxmlformats.org/drawingml/2006/main">
+              <a:graphicData uri="http://schemas.openxmlformats.org/drawingml/2006/picture">
+                <pic:pic xmlns:pic="http://schemas.openxmlformats.org/drawingml/2006/picture">
+                  <pic:nvPicPr>
+                    <pic:cNvPr id="1103997415" name="Picture 1103997415"/>
+                    <pic:cNvPicPr/>
+                  </pic:nvPicPr>
+                  <pic:blipFill>
+                    <a:blip r:embed="rId36" cstate="print">
+                      <a:extLst>
+                        <a:ext uri="{28A0092B-C50C-407E-A947-70E740481C1C}">
+                          <a14:useLocalDpi xmlns:a14="http://schemas.microsoft.com/office/drawing/2010/main" val="0"/>
+                        </a:ext>
+                      </a:extLst>
+                    </a:blip>
+                    <a:stretch>
+                      <a:fillRect/>
+                    </a:stretch>
+                  </pic:blipFill>
+                  <pic:spPr>
+                    <a:xfrm>
+                      <a:off x="0" y="0"/>
+                      <a:ext cx="5943600" cy="3460115"/>
+                    </a:xfrm>
+                    <a:prstGeom prst="rect">
+                      <a:avLst/>
+                    </a:prstGeom>
+                  </pic:spPr>
+                </pic:pic>
+              </a:graphicData>
+            </a:graphic>
+          </wp:inline>
+        </w:drawing>
+      </w:r>
+    </w:p>
+    <w:p/>
+    <w:p>
+      <w:r>
+        <w:lastRenderedPageBreak/>
+        <w:t>FIG 4: PERMUTATION OUTPUT</w:t>
+      </w:r>
+    </w:p>
+    <w:p>
+      <w:r>
+        <w:rPr>
+          <w:noProof/>
+        </w:rPr>
+        <w:drawing>
+          <wp:inline distT="0" distB="0" distL="0" distR="0" wp14:anchorId="1BC118D0" wp14:editId="4B3DE9A6">
+            <wp:extent cx="5943600" cy="3460115"/>
+            <wp:effectExtent l="0" t="0" r="0" b="6985"/>
+            <wp:docPr id="183526723" name="Picture 4"/>
+            <wp:cNvGraphicFramePr>
+              <a:graphicFrameLocks xmlns:a="http://schemas.openxmlformats.org/drawingml/2006/main" noChangeAspect="1"/>
+            </wp:cNvGraphicFramePr>
+            <a:graphic xmlns:a="http://schemas.openxmlformats.org/drawingml/2006/main">
+              <a:graphicData uri="http://schemas.openxmlformats.org/drawingml/2006/picture">
+                <pic:pic xmlns:pic="http://schemas.openxmlformats.org/drawingml/2006/picture">
+                  <pic:nvPicPr>
+                    <pic:cNvPr id="183526723" name="Picture 183526723"/>
+                    <pic:cNvPicPr/>
+                  </pic:nvPicPr>
+                  <pic:blipFill>
+                    <a:blip r:embed="rId36" cstate="print">
+                      <a:extLst>
+                        <a:ext uri="{28A0092B-C50C-407E-A947-70E740481C1C}">
+                          <a14:useLocalDpi xmlns:a14="http://schemas.microsoft.com/office/drawing/2010/main" val="0"/>
+                        </a:ext>
+                      </a:extLst>
+                    </a:blip>
+                    <a:stretch>
+                      <a:fillRect/>
+                    </a:stretch>
+                  </pic:blipFill>
+                  <pic:spPr>
+                    <a:xfrm>
+                      <a:off x="0" y="0"/>
+                      <a:ext cx="5943600" cy="3460115"/>
+                    </a:xfrm>
+                    <a:prstGeom prst="rect">
+                      <a:avLst/>
+                    </a:prstGeom>
+                  </pic:spPr>
+                </pic:pic>
+              </a:graphicData>
+            </a:graphic>
+          </wp:inline>
+        </w:drawing>
+      </w:r>
+    </w:p>
+    <w:p/>
+    <w:p>
+      <w:r>
+        <w:t>FIG 5: AVALANCHE TEST</w:t>
+      </w:r>
+    </w:p>
+    <w:p>
+      <w:pPr>
+        <w:rPr>
+          <w:b/>
+          <w:bCs/>
+        </w:rPr>
+      </w:pPr>
+      <w:r>
+        <w:rPr>
+          <w:noProof/>
+        </w:rPr>
+        <w:drawing>
+          <wp:inline distT="0" distB="0" distL="0" distR="0" wp14:anchorId="051EB232" wp14:editId="5B2318E0">
+            <wp:extent cx="5943600" cy="3460115"/>
+            <wp:effectExtent l="0" t="0" r="0" b="6985"/>
+            <wp:docPr id="766882063" name="Picture 4"/>
+            <wp:cNvGraphicFramePr>
+              <a:graphicFrameLocks xmlns:a="http://schemas.openxmlformats.org/drawingml/2006/main" noChangeAspect="1"/>
+            </wp:cNvGraphicFramePr>
+            <a:graphic xmlns:a="http://schemas.openxmlformats.org/drawingml/2006/main">
+              <a:graphicData uri="http://schemas.openxmlformats.org/drawingml/2006/picture">
+                <pic:pic xmlns:pic="http://schemas.openxmlformats.org/drawingml/2006/picture">
+                  <pic:nvPicPr>
+                    <pic:cNvPr id="183526723" name="Picture 183526723"/>
+                    <pic:cNvPicPr/>
+                  </pic:nvPicPr>
+                  <pic:blipFill>
+                    <a:blip r:embed="rId36" cstate="print">
+                      <a:extLst>
+                        <a:ext uri="{28A0092B-C50C-407E-A947-70E740481C1C}">
+                          <a14:useLocalDpi xmlns:a14="http://schemas.microsoft.com/office/drawing/2010/main" val="0"/>
+                        </a:ext>
+                      </a:extLst>
+                    </a:blip>
+                    <a:stretch>
+                      <a:fillRect/>
+                    </a:stretch>
+                  </pic:blipFill>
+                  <pic:spPr>
+                    <a:xfrm>
+                      <a:off x="0" y="0"/>
+                      <a:ext cx="5943600" cy="3460115"/>
+                    </a:xfrm>
+                    <a:prstGeom prst="rect">
+                      <a:avLst/>
+                    </a:prstGeom>
+                  </pic:spPr>
+                </pic:pic>
+              </a:graphicData>
+            </a:graphic>
+          </wp:inline>
+        </w:drawing>
+      </w:r>
+    </w:p>
+    <w:p>
+      <w:pPr>
+        <w:rPr>
+          <w:b/>
+          <w:bCs/>
+        </w:rPr>
+      </w:pPr>
+      <w:r>
+        <w:rPr>
+          <w:b/>
+          <w:bCs/>
+        </w:rPr>
+        <w:lastRenderedPageBreak/>
+        <w:t>PART 2: NON-LINEARITY INVESTIGATION REPORT</w:t>
+      </w:r>
+    </w:p>
+    <w:p>
+      <w:pPr>
+        <w:rPr>
+          <w:b/>
+          <w:bCs/>
+        </w:rPr>
+      </w:pPr>
+    </w:p>
+    <w:p>
+      <w:r>
+        <w:rPr>
+          <w:b/>
+          <w:bCs/>
+        </w:rPr>
+        <w:t>INTRODUCTION</w:t>
+      </w:r>
+    </w:p>
+    <w:p>
+      <w:r>
+        <w:t>Non-linearity is a fundamental concept in modern cryptography that ensures encryption algorithms remain secure against mathematical and statistical attacks. In block cipher design, non-linearity prevents attackers from expressing encryption systems using simple linear equations, which would otherwise make cryptanalysis easier.</w:t>
+      </w:r>
+    </w:p>
+    <w:p>
+      <w:r>
+        <w:t>Modern encryption systems such as the Advanced Encryption Standard (AES) rely heavily on Substitution-Permutation Networks (SPNs), which use substitution boxes (S-Boxes) to introduce non-linear transformations. This report explores the concept of non-linearity, its importance in cryptographic systems, and how S-Boxes contribute to secure encryption.</w:t>
+      </w:r>
+    </w:p>
+    <w:p>
+      <w:r>
+        <w:pict w14:anchorId="483D180E">
+          <v:rect id="_x0000_i1073" style="width:0;height:1.5pt" o:hralign="center" o:hrstd="t" o:hr="t" fillcolor="#a0a0a0" stroked="f"/>
+        </w:pict>
+      </w:r>
+      <w:r>
+        <w:rPr>
+          <w:b/>
+          <w:bCs/>
+        </w:rPr>
+        <w:t xml:space="preserve"> WHAT IS NON-LINEARITY?</w:t>
+      </w:r>
+    </w:p>
+    <w:p>
+      <w:r>
+        <w:t>Non-linearity refers to a transformation where the relationship between input and output cannot be represented using linear mathematical equations.</w:t>
+      </w:r>
+    </w:p>
+    <w:p>
+      <w:r>
+        <w:t>In cryptography, a function is considered linear if it satisfies:</w:t>
+      </w:r>
+    </w:p>
+    <w:p>
+      <w:pPr>
+        <w:numPr>
+          <w:ilvl w:val="0"/>
+          <w:numId w:val="1"/>
+        </w:numPr>
+      </w:pPr>
+      <w:proofErr w:type="gramStart"/>
+      <w:r>
+        <w:t>f(</w:t>
+      </w:r>
+      <w:proofErr w:type="gramEnd"/>
+      <w:r>
+        <w:t xml:space="preserve">x + y) = f(x) + f(y) </w:t>
+      </w:r>
+    </w:p>
+    <w:p>
+      <w:pPr>
+        <w:numPr>
+          <w:ilvl w:val="0"/>
+          <w:numId w:val="1"/>
+        </w:numPr>
+      </w:pPr>
+      <w:r>
+        <w:t>f(</w:t>
+      </w:r>
+      <w:proofErr w:type="spellStart"/>
+      <w:r>
+        <w:t>kx</w:t>
+      </w:r>
+      <w:proofErr w:type="spellEnd"/>
+      <w:r>
+        <w:t xml:space="preserve">) = </w:t>
+      </w:r>
+      <w:proofErr w:type="spellStart"/>
+      <w:r>
+        <w:t>kf</w:t>
+      </w:r>
+      <w:proofErr w:type="spellEnd"/>
+      <w:r>
+        <w:t xml:space="preserve">(x) </w:t>
+      </w:r>
+    </w:p>
+    <w:p>
+      <w:r>
+        <w:t>However, secure encryption functions deliberately violate these properties to prevent predictability.</w:t>
+      </w:r>
+    </w:p>
+    <w:p>
+      <w:pPr>
+        <w:rPr>
+          <w:b/>
+          <w:bCs/>
+        </w:rPr>
+      </w:pPr>
+      <w:r>
+        <w:rPr>
+          <w:b/>
+          <w:bCs/>
+        </w:rPr>
+        <w:t>Simple Explanation:</w:t>
+      </w:r>
+    </w:p>
+    <w:p>
+      <w:r>
+        <w:t>A non-linear system ensures that:</w:t>
+      </w:r>
+    </w:p>
+    <w:p>
+      <w:pPr>
+        <w:numPr>
+          <w:ilvl w:val="0"/>
+          <w:numId w:val="2"/>
+        </w:numPr>
+      </w:pPr>
+      <w:r>
+        <w:t xml:space="preserve">Small input changes do NOT produce predictable output changes </w:t>
+      </w:r>
+    </w:p>
+    <w:p>
+      <w:pPr>
+        <w:numPr>
+          <w:ilvl w:val="0"/>
+          <w:numId w:val="2"/>
+        </w:numPr>
+      </w:pPr>
+      <w:r>
+        <w:t xml:space="preserve">Outputs cannot be modeled using simple algebra </w:t>
+      </w:r>
+    </w:p>
+    <w:p>
+      <w:r>
+        <w:t>This unpredictability is essential in secure encryption systems.</w:t>
+      </w:r>
+    </w:p>
+    <w:p>
+      <w:r>
+        <w:pict w14:anchorId="6AD0A05C">
+          <v:rect id="_x0000_i1074" style="width:0;height:1.5pt" o:hralign="center" o:hrstd="t" o:hr="t" fillcolor="#a0a0a0" stroked="f"/>
+        </w:pict>
+      </w:r>
+    </w:p>
+    <w:p>
+      <w:pPr>
+        <w:rPr>
+          <w:b/>
+          <w:bCs/>
+        </w:rPr>
+      </w:pPr>
+      <w:r>
+        <w:rPr>
+          <w:b/>
+          <w:bCs/>
+        </w:rPr>
+        <w:t>IMPORTANCE OF NON-LINEARITY IN CRYPTOGRAPHY</w:t>
+      </w:r>
+    </w:p>
+    <w:p>
+      <w:r>
+        <w:t>Non-linearity plays a critical role in protecting cryptographic systems from attacks.</w:t>
+      </w:r>
+    </w:p>
+    <w:p>
+      <w:pPr>
+        <w:rPr>
+          <w:b/>
+          <w:bCs/>
+        </w:rPr>
+      </w:pPr>
+      <w:r>
+        <w:rPr>
+          <w:b/>
+          <w:bCs/>
+        </w:rPr>
+        <w:t>3.1 Protection Against Linear Cryptanalysis</w:t>
+      </w:r>
+    </w:p>
+    <w:p>
+      <w:r>
+        <w:lastRenderedPageBreak/>
+        <w:t>Linear cryptanalysis attempts to approximate encryption using linear equations. Non-linear systems make this impossible.</w:t>
+      </w:r>
+    </w:p>
+    <w:p>
+      <w:pPr>
+        <w:rPr>
+          <w:b/>
+          <w:bCs/>
+        </w:rPr>
+      </w:pPr>
+      <w:r>
+        <w:rPr>
+          <w:b/>
+          <w:bCs/>
+        </w:rPr>
+        <w:t>3.2 Data Security</w:t>
+      </w:r>
+    </w:p>
+    <w:p>
+      <w:r>
+        <w:t>Non-linearity ensures ciphertext appears random and unrelated to plaintext.</w:t>
+      </w:r>
+    </w:p>
+    <w:p>
+      <w:pPr>
+        <w:rPr>
+          <w:b/>
+          <w:bCs/>
+        </w:rPr>
+      </w:pPr>
+      <w:r>
+        <w:rPr>
+          <w:b/>
+          <w:bCs/>
+        </w:rPr>
+        <w:t>3.3 Avalanche Effect</w:t>
+      </w:r>
+    </w:p>
+    <w:p>
+      <w:r>
+        <w:t>A small change in input produces a completely different output.</w:t>
+      </w:r>
+    </w:p>
+    <w:p>
+      <w:r>
+        <w:t>Example:</w:t>
+      </w:r>
+    </w:p>
+    <w:p>
+      <w:pPr>
+        <w:numPr>
+          <w:ilvl w:val="0"/>
+          <w:numId w:val="3"/>
+        </w:numPr>
+      </w:pPr>
+      <w:r>
+        <w:t xml:space="preserve">Input: 1010 → Output: A3F1 </w:t>
+      </w:r>
+    </w:p>
+    <w:p>
+      <w:pPr>
+        <w:numPr>
+          <w:ilvl w:val="0"/>
+          <w:numId w:val="3"/>
+        </w:numPr>
+      </w:pPr>
+      <w:r>
+        <w:t xml:space="preserve">Input: 1011 → Output: 7C92 </w:t>
+      </w:r>
+    </w:p>
+    <w:p>
+      <w:r>
+        <w:t>Even a 1-bit change results in a completely different ciphertext.</w:t>
+      </w:r>
+    </w:p>
+    <w:p>
+      <w:r>
+        <w:pict w14:anchorId="60A4E101">
+          <v:rect id="_x0000_i1075" style="width:0;height:1.5pt" o:hralign="center" o:hrstd="t" o:hr="t" fillcolor="#a0a0a0" stroked="f"/>
+        </w:pict>
+      </w:r>
+    </w:p>
+    <w:p>
+      <w:pPr>
+        <w:rPr>
+          <w:b/>
+          <w:bCs/>
+        </w:rPr>
+      </w:pPr>
+      <w:r>
+        <w:rPr>
+          <w:b/>
+          <w:bCs/>
+        </w:rPr>
+        <w:t>ROLE OF S-BOXES IN NON-LINEARITY</w:t>
+      </w:r>
+    </w:p>
+    <w:p>
+      <w:r>
+        <w:t>S-Boxes (Substitution Boxes) are the main source of non-linearity in SPN-based cryptographic systems.</w:t>
+      </w:r>
+    </w:p>
+    <w:p>
+      <w:pPr>
+        <w:rPr>
+          <w:b/>
+          <w:bCs/>
+        </w:rPr>
+      </w:pPr>
+      <w:r>
+        <w:rPr>
+          <w:b/>
+          <w:bCs/>
+        </w:rPr>
+        <w:t>4.1 Definition</w:t>
+      </w:r>
+    </w:p>
+    <w:p>
+      <w:r>
+        <w:t>An S-Box is a lookup table that replaces input values with different output values.</w:t>
+      </w:r>
+    </w:p>
+    <w:p>
+      <w:pPr>
+        <w:rPr>
+          <w:b/>
+          <w:bCs/>
+        </w:rPr>
+      </w:pPr>
+      <w:r>
+        <w:rPr>
+          <w:b/>
+          <w:bCs/>
+        </w:rPr>
+        <w:t>4.2 How it Works</w:t>
+      </w:r>
+    </w:p>
+    <w:p>
+      <w:r>
+        <w:t>Instead of using mathematical formulas, S-Boxes map inputs like:</w:t>
+      </w:r>
+    </w:p>
+    <w:tbl>
+      <w:tblPr>
+        <w:tblW w:w="0" w:type="auto"/>
+        <w:tblCellSpacing w:w="15" w:type="dxa"/>
+        <w:tblCellMar>
+          <w:top w:w="15" w:type="dxa"/>
+          <w:left w:w="15" w:type="dxa"/>
+          <w:bottom w:w="15" w:type="dxa"/>
+          <w:right w:w="15" w:type="dxa"/>
+        </w:tblCellMar>
+        <w:tblLook w:val="04A0" w:firstRow="1" w:lastRow="0" w:firstColumn="1" w:lastColumn="0" w:noHBand="0" w:noVBand="1"/>
+      </w:tblPr>
+      <w:tblGrid>
+        <w:gridCol w:w="609"/>
+        <w:gridCol w:w="791"/>
+      </w:tblGrid>
+      <w:tr>
+        <w:trPr>
+          <w:tblHeader/>
+          <w:tblCellSpacing w:w="15" w:type="dxa"/>
+        </w:trPr>
+        <w:tc>
+          <w:tcPr>
+            <w:tcW w:w="0" w:type="auto"/>
+            <w:vAlign w:val="center"/>
+            <w:hideMark/>
+          </w:tcPr>
+          <w:p>
+            <w:pPr>
+              <w:rPr>
+                <w:b/>
+                <w:bCs/>
+              </w:rPr>
+            </w:pPr>
+            <w:r>
+              <w:rPr>
+                <w:b/>
+                <w:bCs/>
+              </w:rPr>
+              <w:t>Input</w:t>
+            </w:r>
+          </w:p>
+        </w:tc>
+        <w:tc>
+          <w:tcPr>
+            <w:tcW w:w="0" w:type="auto"/>
+            <w:vAlign w:val="center"/>
+            <w:hideMark/>
+          </w:tcPr>
+          <w:p>
+            <w:pPr>
+              <w:rPr>
+                <w:b/>
+                <w:bCs/>
+              </w:rPr>
+            </w:pPr>
+            <w:r>
+              <w:rPr>
+                <w:b/>
+                <w:bCs/>
+              </w:rPr>
+              <w:t>Output</w:t>
+            </w:r>
+          </w:p>
+        </w:tc>
+      </w:tr>
+      <w:tr>
+        <w:trPr>
+          <w:tblCellSpacing w:w="15" w:type="dxa"/>
+        </w:trPr>
+        <w:tc>
+          <w:tcPr>
+            <w:tcW w:w="0" w:type="auto"/>
+            <w:vAlign w:val="center"/>
+            <w:hideMark/>
+          </w:tcPr>
+          <w:p>
+            <w:r>
+              <w:t>0000</w:t>
+            </w:r>
+          </w:p>
+        </w:tc>
+        <w:tc>
+          <w:tcPr>
+            <w:tcW w:w="0" w:type="auto"/>
+            <w:vAlign w:val="center"/>
+            <w:hideMark/>
+          </w:tcPr>
+          <w:p>
+            <w:r>
+              <w:t>1110</w:t>
+            </w:r>
+          </w:p>
+        </w:tc>
+      </w:tr>
+      <w:tr>
+        <w:trPr>
+          <w:tblCellSpacing w:w="15" w:type="dxa"/>
+        </w:trPr>
+        <w:tc>
+          <w:tcPr>
+            <w:tcW w:w="0" w:type="auto"/>
+            <w:vAlign w:val="center"/>
+            <w:hideMark/>
+          </w:tcPr>
+          <w:p>
+            <w:r>
+              <w:t>0001</w:t>
+            </w:r>
+          </w:p>
+        </w:tc>
+        <w:tc>
+          <w:tcPr>
+            <w:tcW w:w="0" w:type="auto"/>
+            <w:vAlign w:val="center"/>
+            <w:hideMark/>
+          </w:tcPr>
+          <w:p>
+            <w:r>
+              <w:t>0100</w:t>
+            </w:r>
+          </w:p>
+        </w:tc>
+      </w:tr>
+      <w:tr>
+        <w:trPr>
+          <w:tblCellSpacing w:w="15" w:type="dxa"/>
+        </w:trPr>
+        <w:tc>
+          <w:tcPr>
+            <w:tcW w:w="0" w:type="auto"/>
+            <w:vAlign w:val="center"/>
+            <w:hideMark/>
+          </w:tcPr>
+          <w:p>
+            <w:r>
+              <w:t>0010</w:t>
+            </w:r>
+          </w:p>
+        </w:tc>
+        <w:tc>
+          <w:tcPr>
+            <w:tcW w:w="0" w:type="auto"/>
+            <w:vAlign w:val="center"/>
+            <w:hideMark/>
+          </w:tcPr>
+          <w:p>
+            <w:r>
+              <w:t>1101</w:t>
+            </w:r>
+          </w:p>
+        </w:tc>
+      </w:tr>
+    </w:tbl>
+    <w:p>
+      <w:r>
+        <w:t>This mapping is intentionally irregular.</w:t>
+      </w:r>
+    </w:p>
+    <w:p>
+      <w:pPr>
+        <w:rPr>
+          <w:b/>
+          <w:bCs/>
+        </w:rPr>
+      </w:pPr>
+      <w:r>
+        <w:rPr>
+          <w:b/>
+          <w:bCs/>
+        </w:rPr>
+        <w:t xml:space="preserve">4.3 Why S-Boxes are </w:t>
+      </w:r>
+      <w:proofErr w:type="gramStart"/>
+      <w:r>
+        <w:rPr>
+          <w:b/>
+          <w:bCs/>
+        </w:rPr>
+        <w:t>Non-Linear</w:t>
+      </w:r>
+      <w:proofErr w:type="gramEnd"/>
+    </w:p>
+    <w:p>
+      <w:r>
+        <w:t>S-Boxes are non-linear because:</w:t>
+      </w:r>
+    </w:p>
+    <w:p>
+      <w:pPr>
+        <w:numPr>
+          <w:ilvl w:val="0"/>
+          <w:numId w:val="4"/>
+        </w:numPr>
+      </w:pPr>
+      <w:r>
+        <w:t xml:space="preserve">They do not follow arithmetic rules </w:t>
+      </w:r>
+    </w:p>
+    <w:p>
+      <w:pPr>
+        <w:numPr>
+          <w:ilvl w:val="0"/>
+          <w:numId w:val="4"/>
+        </w:numPr>
+      </w:pPr>
+      <w:r>
+        <w:lastRenderedPageBreak/>
+        <w:t xml:space="preserve">They are designed to break patterns </w:t>
+      </w:r>
+    </w:p>
+    <w:p>
+      <w:pPr>
+        <w:numPr>
+          <w:ilvl w:val="0"/>
+          <w:numId w:val="4"/>
+        </w:numPr>
+      </w:pPr>
+      <w:r>
+        <w:t xml:space="preserve">They prevent reverse engineering of encryption </w:t>
+      </w:r>
+    </w:p>
+    <w:p>
+      <w:r>
+        <w:pict w14:anchorId="3058DFAC">
+          <v:rect id="_x0000_i1076" style="width:0;height:1.5pt" o:hralign="center" o:hrstd="t" o:hr="t" fillcolor="#a0a0a0" stroked="f"/>
+        </w:pict>
+      </w:r>
+    </w:p>
+    <w:p>
+      <w:pPr>
+        <w:rPr>
+          <w:b/>
+          <w:bCs/>
+        </w:rPr>
+      </w:pPr>
+      <w:r>
+        <w:rPr>
+          <w:b/>
+          <w:bCs/>
+        </w:rPr>
+        <w:t>SECURITY BENEFITS OF NON-LINEARITY</w:t>
+      </w:r>
+    </w:p>
+    <w:p>
+      <w:r>
+        <w:t>Non-linearity improves cryptographic strength in the following ways:</w:t>
+      </w:r>
+    </w:p>
+    <w:p>
+      <w:pPr>
+        <w:rPr>
+          <w:b/>
+          <w:bCs/>
+        </w:rPr>
+      </w:pPr>
+      <w:r>
+        <w:rPr>
+          <w:b/>
+          <w:bCs/>
+        </w:rPr>
+        <w:t>5.1 Resistance to Attacks</w:t>
+      </w:r>
+    </w:p>
+    <w:p>
+      <w:pPr>
+        <w:numPr>
+          <w:ilvl w:val="0"/>
+          <w:numId w:val="5"/>
+        </w:numPr>
+      </w:pPr>
+      <w:r>
+        <w:t xml:space="preserve">Linear cryptanalysis becomes ineffective </w:t>
+      </w:r>
+    </w:p>
+    <w:p>
+      <w:pPr>
+        <w:numPr>
+          <w:ilvl w:val="0"/>
+          <w:numId w:val="5"/>
+        </w:numPr>
+      </w:pPr>
+      <w:r>
+        <w:t xml:space="preserve">Differential cryptanalysis becomes harder </w:t>
+      </w:r>
+    </w:p>
+    <w:p>
+      <w:pPr>
+        <w:rPr>
+          <w:b/>
+          <w:bCs/>
+        </w:rPr>
+      </w:pPr>
+      <w:r>
+        <w:rPr>
+          <w:b/>
+          <w:bCs/>
+        </w:rPr>
+        <w:t>5.2 Increased Confusion</w:t>
+      </w:r>
+    </w:p>
+    <w:p>
+      <w:r>
+        <w:t>Each output bit depends on multiple input bits.</w:t>
+      </w:r>
+    </w:p>
+    <w:p>
+      <w:pPr>
+        <w:rPr>
+          <w:b/>
+          <w:bCs/>
+        </w:rPr>
+      </w:pPr>
+      <w:r>
+        <w:rPr>
+          <w:b/>
+          <w:bCs/>
+        </w:rPr>
+        <w:t>5.3 Unpredictability</w:t>
+      </w:r>
+    </w:p>
+    <w:p>
+      <w:r>
+        <w:t>Attackers cannot predict output even if they know part of the input.</w:t>
+      </w:r>
+    </w:p>
+    <w:p>
+      <w:pPr>
+        <w:rPr>
+          <w:b/>
+          <w:bCs/>
+        </w:rPr>
+      </w:pPr>
+      <w:r>
+        <w:rPr>
+          <w:b/>
+          <w:bCs/>
+        </w:rPr>
+        <w:t>5.4 Strong Avalanche Effect</w:t>
+      </w:r>
+    </w:p>
+    <w:p>
+      <w:r>
+        <w:t>A single bit change produces major output differences.</w:t>
+      </w:r>
+    </w:p>
+    <w:p>
+      <w:r>
+        <w:pict w14:anchorId="5C898A12">
+          <v:rect id="_x0000_i1077" style="width:0;height:1.5pt" o:hralign="center" o:hrstd="t" o:hr="t" fillcolor="#a0a0a0" stroked="f"/>
+        </w:pict>
+      </w:r>
+      <w:r>
+        <w:rPr>
+          <w:b/>
+          <w:bCs/>
+        </w:rPr>
+        <w:t xml:space="preserve"> EXAMPLE FROM PRACTICAL IMPLEMENTATION</w:t>
+      </w:r>
+    </w:p>
+    <w:p>
+      <w:r>
+        <w:t>In the SPN Python implementation:</w:t>
+      </w:r>
+    </w:p>
+    <w:p>
+      <w:pPr>
+        <w:numPr>
+          <w:ilvl w:val="0"/>
+          <w:numId w:val="6"/>
+        </w:numPr>
+      </w:pPr>
+      <w:r>
+        <w:t xml:space="preserve">Plaintext is XORed with a key (key mixing) </w:t>
+      </w:r>
+    </w:p>
+    <w:p>
+      <w:pPr>
+        <w:numPr>
+          <w:ilvl w:val="0"/>
+          <w:numId w:val="6"/>
+        </w:numPr>
+      </w:pPr>
+      <w:r>
+        <w:t xml:space="preserve">Output passes through an S-Box (substitution) </w:t>
+      </w:r>
+    </w:p>
+    <w:p>
+      <w:pPr>
+        <w:numPr>
+          <w:ilvl w:val="0"/>
+          <w:numId w:val="6"/>
+        </w:numPr>
+      </w:pPr>
+      <w:r>
+        <w:t xml:space="preserve">Bits are rearranged (permutation) </w:t>
+      </w:r>
+    </w:p>
+    <w:p>
+      <w:r>
+        <w:t>Example:</w:t>
+      </w:r>
+    </w:p>
+    <w:p>
+      <w:r>
+        <w:t xml:space="preserve">Plaintext: 1010  </w:t>
+      </w:r>
+      <w:r>
+        <w:br/>
+        <w:t xml:space="preserve">Key:       0101  </w:t>
+      </w:r>
+      <w:r>
+        <w:br/>
+        <w:t xml:space="preserve">XOR:       1111  </w:t>
+      </w:r>
+      <w:r>
+        <w:br/>
+        <w:t xml:space="preserve">S-Box:     0111  </w:t>
+      </w:r>
+      <w:r>
+        <w:br/>
+        <w:t>Permutation: 1011</w:t>
+      </w:r>
+    </w:p>
+    <w:p>
+      <w:r>
+        <w:t>This shows how multiple transformations increase security.</w:t>
+      </w:r>
+    </w:p>
+    <w:p>
+      <w:r>
+        <w:lastRenderedPageBreak/>
+        <w:pict w14:anchorId="2382C469">
+          <v:rect id="_x0000_i1078" style="width:0;height:1.5pt" o:hralign="center" o:hrstd="t" o:hr="t" fillcolor="#a0a0a0" stroked="f"/>
+        </w:pict>
+      </w:r>
+    </w:p>
+    <w:p>
+      <w:pPr>
+        <w:rPr>
+          <w:b/>
+          <w:bCs/>
+        </w:rPr>
+      </w:pPr>
+      <w:r>
+        <w:rPr>
+          <w:b/>
+          <w:bCs/>
+        </w:rPr>
+        <w:t xml:space="preserve"> REAL-WORLD APPLICATIONS</w:t>
+      </w:r>
+    </w:p>
+    <w:p>
+      <w:r>
+        <w:t>Non-linearity and S-Boxes are used in:</w:t>
+      </w:r>
+    </w:p>
+    <w:p>
+      <w:pPr>
+        <w:numPr>
+          <w:ilvl w:val="0"/>
+          <w:numId w:val="7"/>
+        </w:numPr>
+      </w:pPr>
+      <w:r>
+        <w:t xml:space="preserve">AES Encryption (banking systems) </w:t>
+      </w:r>
+    </w:p>
+    <w:p>
+      <w:pPr>
+        <w:numPr>
+          <w:ilvl w:val="0"/>
+          <w:numId w:val="7"/>
+        </w:numPr>
+      </w:pPr>
+      <w:r>
+        <w:t xml:space="preserve">Secure messaging apps (WhatsApp, Signal) </w:t>
+      </w:r>
+    </w:p>
+    <w:p>
+      <w:pPr>
+        <w:numPr>
+          <w:ilvl w:val="0"/>
+          <w:numId w:val="7"/>
+        </w:numPr>
+      </w:pPr>
+      <w:r>
+        <w:t xml:space="preserve">VPN encryption systems </w:t>
+      </w:r>
+    </w:p>
+    <w:p>
+      <w:pPr>
+        <w:numPr>
+          <w:ilvl w:val="0"/>
+          <w:numId w:val="7"/>
+        </w:numPr>
+      </w:pPr>
+      <w:r>
+        <w:t xml:space="preserve">Cloud data protection </w:t>
+      </w:r>
+    </w:p>
+    <w:p>
+      <w:pPr>
+        <w:numPr>
+          <w:ilvl w:val="0"/>
+          <w:numId w:val="7"/>
+        </w:numPr>
+      </w:pPr>
+      <w:r>
+        <w:t xml:space="preserve">Government security systems </w:t>
+      </w:r>
+    </w:p>
+    <w:p>
+      <w:r>
+        <w:pict w14:anchorId="6AB5AAE3">
+          <v:rect id="_x0000_i1079" style="width:0;height:1.5pt" o:hralign="center" o:hrstd="t" o:hr="t" fillcolor="#a0a0a0" stroked="f"/>
+        </w:pict>
+      </w:r>
+      <w:r>
+        <w:rPr>
+          <w:b/>
+          <w:bCs/>
+        </w:rPr>
+        <w:t xml:space="preserve"> CONCLUSION</w:t>
+      </w:r>
+    </w:p>
+    <w:p>
+      <w:r>
+        <w:t>Non-linearity is a core principle in modern cryptography that ensures secure data encryption. S-Boxes introduce this non-linearity by replacing inputs with complex, non-predictable outputs. Combined with permutation and key mixing in SPNs, they create highly secure encryption systems resistant to modern cryptanalysis techniques.</w:t>
+      </w:r>
+    </w:p>
+    <w:p>
+      <w:r>
+        <w:pict w14:anchorId="5669AFE3">
+          <v:rect id="_x0000_i1080" style="width:0;height:1.5pt" o:hralign="center" o:hrstd="t" o:hr="t" fillcolor="#a0a0a0" stroked="f"/>
+        </w:pict>
+      </w:r>
+    </w:p>
+    <w:p>
+      <w:pPr>
+        <w:rPr>
+          <w:b/>
+          <w:bCs/>
+        </w:rPr>
+      </w:pPr>
+      <w:r>
+        <w:rPr>
+          <w:b/>
+          <w:bCs/>
+        </w:rPr>
+        <w:t xml:space="preserve"> REFERENCES</w:t>
+      </w:r>
+    </w:p>
+    <w:p>
+      <w:pPr>
+        <w:numPr>
+          <w:ilvl w:val="0"/>
+          <w:numId w:val="8"/>
+        </w:numPr>
+      </w:pPr>
+      <w:r>
+        <w:t xml:space="preserve">Stallings, W. (2017). </w:t>
+      </w:r>
+      <w:r>
+        <w:rPr>
+          <w:i/>
+          <w:iCs/>
+        </w:rPr>
+        <w:t>Cryptography and Network Security</w:t>
+      </w:r>
+      <w:r>
+        <w:t xml:space="preserve">. </w:t>
+      </w:r>
+    </w:p>
+    <w:p>
+      <w:pPr>
+        <w:numPr>
+          <w:ilvl w:val="0"/>
+          <w:numId w:val="8"/>
+        </w:numPr>
+      </w:pPr>
+      <w:r>
+        <w:t xml:space="preserve">Daemen, J. &amp; </w:t>
+      </w:r>
+      <w:proofErr w:type="spellStart"/>
+      <w:r>
+        <w:t>Rijmen</w:t>
+      </w:r>
+      <w:proofErr w:type="spellEnd"/>
+      <w:r>
+        <w:t xml:space="preserve">, V. (AES Designers). </w:t>
+      </w:r>
+    </w:p>
+    <w:p>
+      <w:pPr>
+        <w:numPr>
+          <w:ilvl w:val="0"/>
+          <w:numId w:val="8"/>
+        </w:numPr>
+      </w:pPr>
+      <w:r>
+        <w:t xml:space="preserve">Schneier, B. (1996). </w:t>
+      </w:r>
+      <w:r>
+        <w:rPr>
+          <w:i/>
+          <w:iCs/>
+        </w:rPr>
+        <w:t>Applied Cryptography</w:t>
+      </w:r>
+      <w:r>
+        <w:t xml:space="preserve">. </w:t>
+      </w:r>
+    </w:p>
+    <w:p>
+      <w:pPr>
+        <w:numPr>
+          <w:ilvl w:val="0"/>
+          <w:numId w:val="8"/>
+        </w:numPr>
+      </w:pPr>
+      <w:r>
+        <w:t xml:space="preserve">National Institute of Standards and Technology (NIST) AES Documentation. </w:t>
+      </w:r>
+    </w:p>
+    <w:p/>
+    <w:p/>
+    <w:p>
+      <w:r>
+        <w:pict w14:anchorId="33F217C7">
+          <v:rect id="_x0000_i1149" style="width:0;height:1.5pt" o:hralign="center" o:hrstd="t" o:hr="t" fillcolor="#a0a0a0" stroked="f"/>
+        </w:pict>
+      </w:r>
+    </w:p>
+    <w:p>
+      <w:pPr>
+        <w:rPr>
+          <w:b/>
+          <w:bCs/>
+        </w:rPr>
+      </w:pPr>
+      <w:r>
+        <w:rPr>
+          <w:b/>
+          <w:bCs/>
+        </w:rPr>
+        <w:t xml:space="preserve"> SPN VS FEISTEL NETWORK SECURITY EVALUATION</w:t>
+      </w:r>
+    </w:p>
+    <w:p>
+      <w:pPr>
+        <w:rPr>
+          <w:b/>
+          <w:bCs/>
+        </w:rPr>
+      </w:pPr>
+      <w:r>
+        <w:rPr>
+          <w:b/>
+          <w:bCs/>
+        </w:rPr>
+        <w:t xml:space="preserve"> Introduction</w:t>
+      </w:r>
+    </w:p>
+    <w:p>
+      <w:r>
+        <w:t xml:space="preserve">Block cipher design is mainly based on two major structures: </w:t>
+      </w:r>
+      <w:r>
+        <w:rPr>
+          <w:b/>
+          <w:bCs/>
+        </w:rPr>
+        <w:t>Feistel Networks</w:t>
+      </w:r>
+      <w:r>
+        <w:t xml:space="preserve"> and </w:t>
+      </w:r>
+      <w:r>
+        <w:rPr>
+          <w:b/>
+          <w:bCs/>
+        </w:rPr>
+        <w:t>Substitution-Permutation Networks (SPN)</w:t>
+      </w:r>
+      <w:r>
+        <w:t xml:space="preserve">. Both are widely used in cryptography, but they differ significantly in structure, security design, and modern application. This section provides a detailed </w:t>
+      </w:r>
+      <w:r>
+        <w:lastRenderedPageBreak/>
+        <w:t>comparison and explains why SPN-based systems are preferred in modern encryption standards such as AES.</w:t>
+      </w:r>
+    </w:p>
+    <w:p>
+      <w:r>
+        <w:pict w14:anchorId="6986F632">
+          <v:rect id="_x0000_i1150" style="width:0;height:1.5pt" o:hralign="center" o:hrstd="t" o:hr="t" fillcolor="#a0a0a0" stroked="f"/>
+        </w:pict>
+      </w:r>
+    </w:p>
+    <w:p>
+      <w:pPr>
+        <w:rPr>
+          <w:b/>
+          <w:bCs/>
+        </w:rPr>
+      </w:pPr>
+      <w:r>
+        <w:rPr>
+          <w:b/>
+          <w:bCs/>
+        </w:rPr>
+        <w:t>Feistel Network Structure</w:t>
+      </w:r>
+    </w:p>
+    <w:p>
+      <w:r>
+        <w:t>A Feistel network divides the input data block into two halves and processes them through multiple rounds. In each round, a function is applied to one half of the data, and the result is combined with the other half using XOR operations. The halves are then swapped for the next round.</w:t>
+      </w:r>
+    </w:p>
+    <w:p>
+      <w:r>
+        <w:t>One of the key advantages of the Feistel structure is that the same algorithm can be used for both encryption and decryption, simply by reversing the order of the keys. This makes implementation efficient and widely applicable.</w:t>
+      </w:r>
+    </w:p>
+    <w:p>
+      <w:r>
+        <w:t>However, the security of Feistel networks heavily depends on the strength of the round function. If the round function is weak, the entire cipher becomes vulnerable to cryptanalysis attacks.</w:t>
+      </w:r>
+    </w:p>
+    <w:p>
+      <w:r>
+        <w:t xml:space="preserve">Examples of Feistel-based algorithms include </w:t>
+      </w:r>
+      <w:r>
+        <w:rPr>
+          <w:b/>
+          <w:bCs/>
+        </w:rPr>
+        <w:t>DES (Data Encryption Standard)</w:t>
+      </w:r>
+      <w:r>
+        <w:t xml:space="preserve"> and </w:t>
+      </w:r>
+      <w:r>
+        <w:rPr>
+          <w:b/>
+          <w:bCs/>
+        </w:rPr>
+        <w:t>Blowfish</w:t>
+      </w:r>
+      <w:r>
+        <w:t>.</w:t>
+      </w:r>
+    </w:p>
+    <w:p>
+      <w:r>
+        <w:pict w14:anchorId="799FD23F">
+          <v:rect id="_x0000_i1151" style="width:0;height:1.5pt" o:hralign="center" o:hrstd="t" o:hr="t" fillcolor="#a0a0a0" stroked="f"/>
+        </w:pict>
+      </w:r>
+    </w:p>
+    <w:p>
+      <w:pPr>
+        <w:rPr>
+          <w:b/>
+          <w:bCs/>
+        </w:rPr>
+      </w:pPr>
+      <w:r>
+        <w:rPr>
+          <w:b/>
+          <w:bCs/>
+        </w:rPr>
+        <w:t>Substitution-Permutation Network (SPN)</w:t>
+      </w:r>
+    </w:p>
+    <w:p>
+      <w:r>
+        <w:t>A Substitution-Permutation Network (SPN) is a modern block cipher structure that operates on the entire data block in each round. It uses three main operations:</w:t>
+      </w:r>
+    </w:p>
+    <w:p>
+      <w:pPr>
+        <w:numPr>
+          <w:ilvl w:val="0"/>
+          <w:numId w:val="9"/>
+        </w:numPr>
+      </w:pPr>
+      <w:r>
+        <w:rPr>
+          <w:b/>
+          <w:bCs/>
+        </w:rPr>
+        <w:t>Substitution (S-Boxes)</w:t>
+      </w:r>
+      <w:r>
+        <w:t>: Introduces non-linearity</w:t>
+      </w:r>
+    </w:p>
+    <w:p>
+      <w:pPr>
+        <w:numPr>
+          <w:ilvl w:val="0"/>
+          <w:numId w:val="9"/>
+        </w:numPr>
+      </w:pPr>
+      <w:r>
+        <w:rPr>
+          <w:b/>
+          <w:bCs/>
+        </w:rPr>
+        <w:t>Permutation</w:t>
+      </w:r>
+      <w:r>
+        <w:t>: Provides diffusion by rearranging bits</w:t>
+      </w:r>
+    </w:p>
+    <w:p>
+      <w:pPr>
+        <w:numPr>
+          <w:ilvl w:val="0"/>
+          <w:numId w:val="9"/>
+        </w:numPr>
+      </w:pPr>
+      <w:r>
+        <w:rPr>
+          <w:b/>
+          <w:bCs/>
+        </w:rPr>
+        <w:t>Key Mixing</w:t>
+      </w:r>
+      <w:r>
+        <w:t>: Combines the plaintext with the secret key using XOR</w:t>
+      </w:r>
+    </w:p>
+    <w:p>
+      <w:r>
+        <w:t>Unlike Feistel networks, SPNs do not split the data into halves. Instead, the full block is transformed in every round, making the diffusion process faster and more effective.</w:t>
+      </w:r>
+    </w:p>
+    <w:p>
+      <w:r>
+        <w:t xml:space="preserve">SPNs are designed to maximize </w:t>
+      </w:r>
+      <w:r>
+        <w:rPr>
+          <w:b/>
+          <w:bCs/>
+        </w:rPr>
+        <w:t>confusion and non-linearity</w:t>
+      </w:r>
+      <w:r>
+        <w:t>, which makes them highly resistant to modern cryptanalysis techniques.</w:t>
+      </w:r>
+    </w:p>
+    <w:p>
+      <w:r>
+        <w:t xml:space="preserve">A well-known example of an SPN-based cipher is the </w:t>
+      </w:r>
+      <w:r>
+        <w:rPr>
+          <w:b/>
+          <w:bCs/>
+        </w:rPr>
+        <w:t>Advanced Encryption Standard (AES)</w:t>
+      </w:r>
+      <w:r>
+        <w:t>.</w:t>
+      </w:r>
+    </w:p>
+    <w:p>
+      <w:r>
+        <w:pict w14:anchorId="0351C549">
+          <v:rect id="_x0000_i1152" style="width:0;height:1.5pt" o:hralign="center" o:hrstd="t" o:hr="t" fillcolor="#a0a0a0" stroked="f"/>
+        </w:pict>
+      </w:r>
+    </w:p>
+    <w:p>
+      <w:pPr>
+        <w:rPr>
+          <w:b/>
+          <w:bCs/>
+        </w:rPr>
+      </w:pPr>
+      <w:r>
+        <w:rPr>
+          <w:b/>
+          <w:bCs/>
+        </w:rPr>
+        <w:t xml:space="preserve"> Detailed Comparison Table</w:t>
+      </w:r>
+    </w:p>
+    <w:tbl>
+      <w:tblPr>
+        <w:tblW w:w="0" w:type="auto"/>
+        <w:tblCellSpacing w:w="15" w:type="dxa"/>
+        <w:tblCellMar>
+          <w:top w:w="15" w:type="dxa"/>
+          <w:left w:w="15" w:type="dxa"/>
+          <w:bottom w:w="15" w:type="dxa"/>
+          <w:right w:w="15" w:type="dxa"/>
+        </w:tblCellMar>
+        <w:tblLook w:val="04A0" w:firstRow="1" w:lastRow="0" w:firstColumn="1" w:lastColumn="0" w:noHBand="0" w:noVBand="1"/>
+      </w:tblPr>
+      <w:tblGrid>
+        <w:gridCol w:w="2451"/>
+        <w:gridCol w:w="2793"/>
+        <w:gridCol w:w="4116"/>
+      </w:tblGrid>
+      <w:tr>
+        <w:trPr>
+          <w:tblHeader/>
+          <w:tblCellSpacing w:w="15" w:type="dxa"/>
+        </w:trPr>
+        <w:tc>
+          <w:tcPr>
+            <w:tcW w:w="0" w:type="auto"/>
+            <w:vAlign w:val="center"/>
+            <w:hideMark/>
+          </w:tcPr>
+          <w:p>
+            <w:pPr>
+              <w:rPr>
+                <w:b/>
+                <w:bCs/>
+              </w:rPr>
+            </w:pPr>
+            <w:r>
+              <w:rPr>
+                <w:b/>
+                <w:bCs/>
+              </w:rPr>
+              <w:lastRenderedPageBreak/>
+              <w:t>Feature</w:t>
+            </w:r>
+          </w:p>
+        </w:tc>
+        <w:tc>
+          <w:tcPr>
+            <w:tcW w:w="0" w:type="auto"/>
+            <w:vAlign w:val="center"/>
+            <w:hideMark/>
+          </w:tcPr>
+          <w:p>
+            <w:pPr>
+              <w:rPr>
+                <w:b/>
+                <w:bCs/>
+              </w:rPr>
+            </w:pPr>
+            <w:r>
+              <w:rPr>
+                <w:b/>
+                <w:bCs/>
+              </w:rPr>
+              <w:t>Feistel Network</w:t>
+            </w:r>
+          </w:p>
+        </w:tc>
+        <w:tc>
+          <w:tcPr>
+            <w:tcW w:w="0" w:type="auto"/>
+            <w:vAlign w:val="center"/>
+            <w:hideMark/>
+          </w:tcPr>
+          <w:p>
+            <w:pPr>
+              <w:rPr>
+                <w:b/>
+                <w:bCs/>
+              </w:rPr>
+            </w:pPr>
+            <w:r>
+              <w:rPr>
+                <w:b/>
+                <w:bCs/>
+              </w:rPr>
+              <w:t>Substitution-Permutation Network (SPN)</w:t>
+            </w:r>
+          </w:p>
+        </w:tc>
+      </w:tr>
+      <w:tr>
+        <w:trPr>
+          <w:tblCellSpacing w:w="15" w:type="dxa"/>
+        </w:trPr>
+        <w:tc>
+          <w:tcPr>
+            <w:tcW w:w="0" w:type="auto"/>
+            <w:vAlign w:val="center"/>
+            <w:hideMark/>
+          </w:tcPr>
+          <w:p>
+            <w:r>
+              <w:t>Data Processing</w:t>
+            </w:r>
+          </w:p>
+        </w:tc>
+        <w:tc>
+          <w:tcPr>
+            <w:tcW w:w="0" w:type="auto"/>
+            <w:vAlign w:val="center"/>
+            <w:hideMark/>
+          </w:tcPr>
+          <w:p>
+            <w:r>
+              <w:t>Splits data into two halves</w:t>
+            </w:r>
+          </w:p>
+        </w:tc>
+        <w:tc>
+          <w:tcPr>
+            <w:tcW w:w="0" w:type="auto"/>
+            <w:vAlign w:val="center"/>
+            <w:hideMark/>
+          </w:tcPr>
+          <w:p>
+            <w:r>
+              <w:t>Processes entire data block</w:t>
+            </w:r>
+          </w:p>
+        </w:tc>
+      </w:tr>
+      <w:tr>
+        <w:trPr>
+          <w:tblCellSpacing w:w="15" w:type="dxa"/>
+        </w:trPr>
+        <w:tc>
+          <w:tcPr>
+            <w:tcW w:w="0" w:type="auto"/>
+            <w:vAlign w:val="center"/>
+            <w:hideMark/>
+          </w:tcPr>
+          <w:p>
+            <w:r>
+              <w:t>Core Operations</w:t>
+            </w:r>
+          </w:p>
+        </w:tc>
+        <w:tc>
+          <w:tcPr>
+            <w:tcW w:w="0" w:type="auto"/>
+            <w:vAlign w:val="center"/>
+            <w:hideMark/>
+          </w:tcPr>
+          <w:p>
+            <w:r>
+              <w:t>Round function + XOR + swapping</w:t>
+            </w:r>
+          </w:p>
+        </w:tc>
+        <w:tc>
+          <w:tcPr>
+            <w:tcW w:w="0" w:type="auto"/>
+            <w:vAlign w:val="center"/>
+            <w:hideMark/>
+          </w:tcPr>
+          <w:p>
+            <w:r>
+              <w:t>Substitution, permutation, key mixing</w:t>
+            </w:r>
+          </w:p>
+        </w:tc>
+      </w:tr>
+      <w:tr>
+        <w:trPr>
+          <w:tblCellSpacing w:w="15" w:type="dxa"/>
+        </w:trPr>
+        <w:tc>
+          <w:tcPr>
+            <w:tcW w:w="0" w:type="auto"/>
+            <w:vAlign w:val="center"/>
+            <w:hideMark/>
+          </w:tcPr>
+          <w:p>
+            <w:r>
+              <w:t>Non-Linearity Source</w:t>
+            </w:r>
+          </w:p>
+        </w:tc>
+        <w:tc>
+          <w:tcPr>
+            <w:tcW w:w="0" w:type="auto"/>
+            <w:vAlign w:val="center"/>
+            <w:hideMark/>
+          </w:tcPr>
+          <w:p>
+            <w:r>
+              <w:t>Round function</w:t>
+            </w:r>
+          </w:p>
+        </w:tc>
+        <w:tc>
+          <w:tcPr>
+            <w:tcW w:w="0" w:type="auto"/>
+            <w:vAlign w:val="center"/>
+            <w:hideMark/>
+          </w:tcPr>
+          <w:p>
+            <w:r>
+              <w:t>S-Boxes (strong non-linear transformation)</w:t>
+            </w:r>
+          </w:p>
+        </w:tc>
+      </w:tr>
+      <w:tr>
+        <w:trPr>
+          <w:tblCellSpacing w:w="15" w:type="dxa"/>
+        </w:trPr>
+        <w:tc>
+          <w:tcPr>
+            <w:tcW w:w="0" w:type="auto"/>
+            <w:vAlign w:val="center"/>
+            <w:hideMark/>
+          </w:tcPr>
+          <w:p>
+            <w:r>
+              <w:t>Diffusion Method</w:t>
+            </w:r>
+          </w:p>
+        </w:tc>
+        <w:tc>
+          <w:tcPr>
+            <w:tcW w:w="0" w:type="auto"/>
+            <w:vAlign w:val="center"/>
+            <w:hideMark/>
+          </w:tcPr>
+          <w:p>
+            <w:r>
+              <w:t>Half swapping over rounds</w:t>
+            </w:r>
+          </w:p>
+        </w:tc>
+        <w:tc>
+          <w:tcPr>
+            <w:tcW w:w="0" w:type="auto"/>
+            <w:vAlign w:val="center"/>
+            <w:hideMark/>
+          </w:tcPr>
+          <w:p>
+            <w:r>
+              <w:t>Bit-level permutation across full block</w:t>
+            </w:r>
+          </w:p>
+        </w:tc>
+      </w:tr>
+      <w:tr>
+        <w:trPr>
+          <w:tblCellSpacing w:w="15" w:type="dxa"/>
+        </w:trPr>
+        <w:tc>
+          <w:tcPr>
+            <w:tcW w:w="0" w:type="auto"/>
+            <w:vAlign w:val="center"/>
+            <w:hideMark/>
+          </w:tcPr>
+          <w:p>
+            <w:r>
+              <w:t>Encryption &amp; Decryption</w:t>
+            </w:r>
+          </w:p>
+        </w:tc>
+        <w:tc>
+          <w:tcPr>
+            <w:tcW w:w="0" w:type="auto"/>
+            <w:vAlign w:val="center"/>
+            <w:hideMark/>
+          </w:tcPr>
+          <w:p>
+            <w:r>
+              <w:t>Same structure (reverse keys)</w:t>
+            </w:r>
+          </w:p>
+        </w:tc>
+        <w:tc>
+          <w:tcPr>
+            <w:tcW w:w="0" w:type="auto"/>
+            <w:vAlign w:val="center"/>
+            <w:hideMark/>
+          </w:tcPr>
+          <w:p>
+            <w:r>
+              <w:t>Uses inverse operations</w:t>
+            </w:r>
+          </w:p>
+        </w:tc>
+      </w:tr>
+      <w:tr>
+        <w:trPr>
+          <w:tblCellSpacing w:w="15" w:type="dxa"/>
+        </w:trPr>
+        <w:tc>
+          <w:tcPr>
+            <w:tcW w:w="0" w:type="auto"/>
+            <w:vAlign w:val="center"/>
+            <w:hideMark/>
+          </w:tcPr>
+          <w:p>
+            <w:r>
+              <w:t>Implementation Complexity</w:t>
+            </w:r>
+          </w:p>
+        </w:tc>
+        <w:tc>
+          <w:tcPr>
+            <w:tcW w:w="0" w:type="auto"/>
+            <w:vAlign w:val="center"/>
+            <w:hideMark/>
+          </w:tcPr>
+          <w:p>
+            <w:r>
+              <w:t>Simpler</w:t>
+            </w:r>
+          </w:p>
+        </w:tc>
+        <w:tc>
+          <w:tcPr>
+            <w:tcW w:w="0" w:type="auto"/>
+            <w:vAlign w:val="center"/>
+            <w:hideMark/>
+          </w:tcPr>
+          <w:p>
+            <w:r>
+              <w:t>Slightly more complex</w:t>
+            </w:r>
+          </w:p>
+        </w:tc>
+      </w:tr>
+      <w:tr>
+        <w:trPr>
+          <w:tblCellSpacing w:w="15" w:type="dxa"/>
+        </w:trPr>
+        <w:tc>
+          <w:tcPr>
+            <w:tcW w:w="0" w:type="auto"/>
+            <w:vAlign w:val="center"/>
+            <w:hideMark/>
+          </w:tcPr>
+          <w:p>
+            <w:r>
+              <w:t>Security Strength</w:t>
+            </w:r>
+          </w:p>
+        </w:tc>
+        <w:tc>
+          <w:tcPr>
+            <w:tcW w:w="0" w:type="auto"/>
+            <w:vAlign w:val="center"/>
+            <w:hideMark/>
+          </w:tcPr>
+          <w:p>
+            <w:r>
+              <w:t>Moderate (depends on design)</w:t>
+            </w:r>
+          </w:p>
+        </w:tc>
+        <w:tc>
+          <w:tcPr>
+            <w:tcW w:w="0" w:type="auto"/>
+            <w:vAlign w:val="center"/>
+            <w:hideMark/>
+          </w:tcPr>
+          <w:p>
+            <w:r>
+              <w:t>High (modern standard)</w:t>
+            </w:r>
+          </w:p>
+        </w:tc>
+      </w:tr>
+      <w:tr>
+        <w:trPr>
+          <w:tblCellSpacing w:w="15" w:type="dxa"/>
+        </w:trPr>
+        <w:tc>
+          <w:tcPr>
+            <w:tcW w:w="0" w:type="auto"/>
+            <w:vAlign w:val="center"/>
+            <w:hideMark/>
+          </w:tcPr>
+          <w:p>
+            <w:r>
+              <w:t>Resistance to Attacks</w:t>
+            </w:r>
+          </w:p>
+        </w:tc>
+        <w:tc>
+          <w:tcPr>
+            <w:tcW w:w="0" w:type="auto"/>
+            <w:vAlign w:val="center"/>
+            <w:hideMark/>
+          </w:tcPr>
+          <w:p>
+            <w:r>
+              <w:t>Lower resistance to modern attacks</w:t>
+            </w:r>
+          </w:p>
+        </w:tc>
+        <w:tc>
+          <w:tcPr>
+            <w:tcW w:w="0" w:type="auto"/>
+            <w:vAlign w:val="center"/>
+            <w:hideMark/>
+          </w:tcPr>
+          <w:p>
+            <w:r>
+              <w:t>Strong resistance (linear &amp; differential cryptanalysis)</w:t>
+            </w:r>
+          </w:p>
+        </w:tc>
+      </w:tr>
+      <w:tr>
+        <w:trPr>
+          <w:tblCellSpacing w:w="15" w:type="dxa"/>
+        </w:trPr>
+        <w:tc>
+          <w:tcPr>
+            <w:tcW w:w="0" w:type="auto"/>
+            <w:vAlign w:val="center"/>
+            <w:hideMark/>
+          </w:tcPr>
+          <w:p>
+            <w:r>
+              <w:t>Example Algorithms</w:t>
+            </w:r>
+          </w:p>
+        </w:tc>
+        <w:tc>
+          <w:tcPr>
+            <w:tcW w:w="0" w:type="auto"/>
+            <w:vAlign w:val="center"/>
+            <w:hideMark/>
+          </w:tcPr>
+          <w:p>
+            <w:r>
+              <w:t>DES, Blowfish</w:t>
+            </w:r>
+          </w:p>
+        </w:tc>
+        <w:tc>
+          <w:tcPr>
+            <w:tcW w:w="0" w:type="auto"/>
+            <w:vAlign w:val="center"/>
+            <w:hideMark/>
+          </w:tcPr>
+          <w:p>
+            <w:r>
+              <w:t>AES, SERPENT, PRESENT</w:t>
+            </w:r>
+          </w:p>
+        </w:tc>
+      </w:tr>
+    </w:tbl>
+    <w:p>
+      <w:r>
+        <w:pict w14:anchorId="730A2183">
+          <v:rect id="_x0000_i1153" style="width:0;height:1.5pt" o:hralign="center" o:hrstd="t" o:hr="t" fillcolor="#a0a0a0" stroked="f"/>
+        </w:pict>
+      </w:r>
+    </w:p>
+    <w:p>
+      <w:pPr>
+        <w:rPr>
+          <w:b/>
+          <w:bCs/>
+        </w:rPr>
+      </w:pPr>
+      <w:r>
+        <w:rPr>
+          <w:b/>
+          <w:bCs/>
+        </w:rPr>
+        <w:t>Security Analysis</w:t>
+      </w:r>
+    </w:p>
+    <w:p>
+      <w:r>
+        <w:t>SPN structures are generally considered more secure than Feistel networks due to their stronger use of non-linearity and full-block transformation. The inclusion of S-Boxes ensures that relationships between plaintext and ciphertext are highly complex and non-predictable.</w:t>
+      </w:r>
+    </w:p>
+    <w:p>
+      <w:r>
+        <w:t xml:space="preserve">In addition, SPNs achieve faster and more complete diffusion, meaning that a small change in input affects many parts of the output. This property is known as the </w:t>
+      </w:r>
+      <w:r>
+        <w:rPr>
+          <w:b/>
+          <w:bCs/>
+        </w:rPr>
+        <w:t>avalanche effect</w:t>
+      </w:r>
+      <w:r>
+        <w:t>, which is essential for secure encryption systems.</w:t>
+      </w:r>
+    </w:p>
+    <w:p>
+      <w:r>
+        <w:t>Feistel networks, while historically important, rely heavily on the design of their round function. If poorly designed, they may become vulnerable to linear or differential cryptanalysis.</w:t>
+      </w:r>
+    </w:p>
+    <w:p>
+      <w:r>
+        <w:pict w14:anchorId="66B48DEF">
+          <v:rect id="_x0000_i1154" style="width:0;height:1.5pt" o:hralign="center" o:hrstd="t" o:hr="t" fillcolor="#a0a0a0" stroked="f"/>
+        </w:pict>
+      </w:r>
+    </w:p>
+    <w:p>
+      <w:pPr>
+        <w:rPr>
+          <w:b/>
+          <w:bCs/>
+        </w:rPr>
+      </w:pPr>
+      <w:r>
+        <w:rPr>
+          <w:b/>
+          <w:bCs/>
+        </w:rPr>
+        <w:lastRenderedPageBreak/>
+        <w:t>Real-World Usage</w:t>
+      </w:r>
+    </w:p>
+    <w:p>
+      <w:r>
+        <w:t>Modern cryptographic systems increasingly prefer SPN structures due to their higher security guarantees. For example:</w:t>
+      </w:r>
+    </w:p>
+    <w:p>
+      <w:pPr>
+        <w:numPr>
+          <w:ilvl w:val="0"/>
+          <w:numId w:val="10"/>
+        </w:numPr>
+      </w:pPr>
+      <w:r>
+        <w:rPr>
+          <w:b/>
+          <w:bCs/>
+        </w:rPr>
+        <w:t>AES (Advanced Encryption Standard)</w:t>
+      </w:r>
+      <w:r>
+        <w:t xml:space="preserve"> uses SPN design and is currently the global encryption standard.</w:t>
+      </w:r>
+    </w:p>
+    <w:p>
+      <w:pPr>
+        <w:numPr>
+          <w:ilvl w:val="0"/>
+          <w:numId w:val="10"/>
+        </w:numPr>
+      </w:pPr>
+      <w:r>
+        <w:rPr>
+          <w:b/>
+          <w:bCs/>
+        </w:rPr>
+        <w:t>DES</w:t>
+      </w:r>
+      <w:r>
+        <w:t>, which uses Feistel structure, is now considered insecure due to its small key size and weaker structure.</w:t>
+      </w:r>
+    </w:p>
+    <w:p>
+      <w:pPr>
+        <w:numPr>
+          <w:ilvl w:val="0"/>
+          <w:numId w:val="10"/>
+        </w:numPr>
+      </w:pPr>
+      <w:r>
+        <w:t>Lightweight ciphers for IoT devices may still use simplified Feistel structures due to efficiency.</w:t>
+      </w:r>
+    </w:p>
+    <w:p>
+      <w:r>
+        <w:pict w14:anchorId="37B5F798">
+          <v:rect id="_x0000_i1155" style="width:0;height:1.5pt" o:hralign="center" o:hrstd="t" o:hr="t" fillcolor="#a0a0a0" stroked="f"/>
+        </w:pict>
+      </w:r>
+    </w:p>
+    <w:p>
+      <w:pPr>
+        <w:rPr>
+          <w:b/>
+          <w:bCs/>
+        </w:rPr>
+      </w:pPr>
+      <w:r>
+        <w:rPr>
+          <w:b/>
+          <w:bCs/>
+        </w:rPr>
+        <w:t>Conclusion</w:t>
+      </w:r>
+    </w:p>
+    <w:p>
+      <w:r>
+        <w:t>In conclusion, while both Feistel and SPN structures are important in cryptographic history, SPN-based designs offer stronger security, better diffusion, and higher resistance to modern cryptanalysis techniques. This is why SPNs form the foundation of modern encryption algorithms such as AES, making them more suitable for securing sensitive data in today’s digital systems.</w:t>
+      </w:r>
+    </w:p>
+    <w:p>
+      <w:r>
+        <w:pict w14:anchorId="5AE86007">
+          <v:rect id="_x0000_i1156" style="width:0;height:1.5pt" o:hralign="center" o:hrstd="t" o:hr="t" fillcolor="#a0a0a0" stroked="f"/>
+        </w:pict>
+      </w:r>
+    </w:p>
+    <w:p>
+      <w:pPr>
+        <w:rPr>
+          <w:rFonts w:ascii="Segoe UI Emoji" w:hAnsi="Segoe UI Emoji" w:cs="Segoe UI Emoji"/>
+          <w:b/>
+          <w:bCs/>
+        </w:rPr>
+      </w:pPr>
+    </w:p>
+    <w:p/>
     <w:sectPr>
       <w:pgSz w:w="12240" w:h="15840"/>
       <w:pgMar w:top="1440" w:right="1440" w:bottom="1440" w:left="1440" w:header="708" w:footer="708" w:gutter="0"/>
@@ -2112,6 +4280,1799 @@
     </w:sectPr>
   </w:body>
 </w:document>
+</file>
+
+<file path=word/numbering.xml><?xml version="1.0" encoding="utf-8"?>
+<w:numbering xmlns:wpc="http://schemas.microsoft.com/office/word/2010/wordprocessingCanvas" xmlns:cx="http://schemas.microsoft.com/office/drawing/2014/chartex" xmlns:cx1="http://schemas.microsoft.com/office/drawing/2015/9/8/chartex" xmlns:cx2="http://schemas.microsoft.com/office/drawing/2015/10/21/chartex" xmlns:cx3="http://schemas.microsoft.com/office/drawing/2016/5/9/chartex" xmlns:cx4="http://schemas.microsoft.com/office/drawing/2016/5/10/chartex" xmlns:cx5="http://schemas.microsoft.com/office/drawing/2016/5/11/chartex" xmlns:cx6="http://schemas.microsoft.com/office/drawing/2016/5/12/chartex" xmlns:cx7="http://schemas.microsoft.com/office/drawing/2016/5/13/chartex" xmlns:cx8="http://schemas.microsoft.com/office/drawing/2016/5/14/chartex" xmlns:mc="http://schemas.openxmlformats.org/markup-compatibility/2006" xmlns:aink="http://schemas.microsoft.com/office/drawing/2016/ink" xmlns:am3d="http://schemas.microsoft.com/office/drawing/2017/model3d" xmlns:o="urn:schemas-microsoft-com:office:office" xmlns:oel="http://schemas.microsoft.com/office/2019/extlst" xmlns:r="http://schemas.openxmlformats.org/officeDocument/2006/relationships" xmlns:m="http://schemas.openxmlformats.org/officeDocument/2006/math" xmlns:v="urn:schemas-microsoft-com:vml" xmlns:wp14="http://schemas.microsoft.com/office/word/2010/wordprocessingDrawing" xmlns:wp="http://schemas.openxmlformats.org/drawingml/2006/wordprocessingDrawing" xmlns:w10="urn:schemas-microsoft-com:office:word" xmlns:w="http://schemas.openxmlformats.org/wordprocessingml/2006/main" xmlns:w14="http://schemas.microsoft.com/office/word/2010/wordml" xmlns:w15="http://schemas.microsoft.com/office/word/2012/wordml" xmlns:w16cex="http://schemas.microsoft.com/office/word/2018/wordml/cex" xmlns:w16cid="http://schemas.microsoft.com/office/word/2016/wordml/cid" xmlns:w16="http://schemas.microsoft.com/office/word/2018/wordml" xmlns:w16du="http://schemas.microsoft.com/office/word/2023/wordml/word16du" xmlns:w16sdtdh="http://schemas.microsoft.com/office/word/2020/wordml/sdtdatahash" xmlns:w16sdtfl="http://schemas.microsoft.com/office/word/2024/wordml/sdtformatlock" xmlns:w16se="http://schemas.microsoft.com/office/word/2015/wordml/symex" xmlns:wpg="http://schemas.microsoft.com/office/word/2010/wordprocessingGroup" xmlns:wpi="http://schemas.microsoft.com/office/word/2010/wordprocessingInk" xmlns:wne="http://schemas.microsoft.com/office/word/2006/wordml" xmlns:wps="http://schemas.microsoft.com/office/word/2010/wordprocessingShape" mc:Ignorable="w14 w15 w16se w16cid w16 w16cex w16sdtdh w16sdtfl w16du wp14">
+  <w:abstractNum w:abstractNumId="0" w15:restartNumberingAfterBreak="0">
+    <w:nsid w:val="07080003"/>
+    <w:multiLevelType w:val="multilevel"/>
+    <w:tmpl w:val="34A065DA"/>
+    <w:lvl w:ilvl="0">
+      <w:start w:val="1"/>
+      <w:numFmt w:val="bullet"/>
+      <w:lvlText w:val=""/>
+      <w:lvlJc w:val="left"/>
+      <w:pPr>
+        <w:tabs>
+          <w:tab w:val="num" w:pos="720"/>
+        </w:tabs>
+        <w:ind w:left="720" w:hanging="360"/>
+      </w:pPr>
+      <w:rPr>
+        <w:rFonts w:ascii="Symbol" w:hAnsi="Symbol" w:hint="default"/>
+        <w:sz w:val="20"/>
+      </w:rPr>
+    </w:lvl>
+    <w:lvl w:ilvl="1" w:tentative="1">
+      <w:start w:val="1"/>
+      <w:numFmt w:val="bullet"/>
+      <w:lvlText w:val="o"/>
+      <w:lvlJc w:val="left"/>
+      <w:pPr>
+        <w:tabs>
+          <w:tab w:val="num" w:pos="1440"/>
+        </w:tabs>
+        <w:ind w:left="1440" w:hanging="360"/>
+      </w:pPr>
+      <w:rPr>
+        <w:rFonts w:ascii="Courier New" w:hAnsi="Courier New" w:hint="default"/>
+        <w:sz w:val="20"/>
+      </w:rPr>
+    </w:lvl>
+    <w:lvl w:ilvl="2" w:tentative="1">
+      <w:start w:val="1"/>
+      <w:numFmt w:val="bullet"/>
+      <w:lvlText w:val=""/>
+      <w:lvlJc w:val="left"/>
+      <w:pPr>
+        <w:tabs>
+          <w:tab w:val="num" w:pos="2160"/>
+        </w:tabs>
+        <w:ind w:left="2160" w:hanging="360"/>
+      </w:pPr>
+      <w:rPr>
+        <w:rFonts w:ascii="Wingdings" w:hAnsi="Wingdings" w:hint="default"/>
+        <w:sz w:val="20"/>
+      </w:rPr>
+    </w:lvl>
+    <w:lvl w:ilvl="3" w:tentative="1">
+      <w:start w:val="1"/>
+      <w:numFmt w:val="bullet"/>
+      <w:lvlText w:val=""/>
+      <w:lvlJc w:val="left"/>
+      <w:pPr>
+        <w:tabs>
+          <w:tab w:val="num" w:pos="2880"/>
+        </w:tabs>
+        <w:ind w:left="2880" w:hanging="360"/>
+      </w:pPr>
+      <w:rPr>
+        <w:rFonts w:ascii="Wingdings" w:hAnsi="Wingdings" w:hint="default"/>
+        <w:sz w:val="20"/>
+      </w:rPr>
+    </w:lvl>
+    <w:lvl w:ilvl="4" w:tentative="1">
+      <w:start w:val="1"/>
+      <w:numFmt w:val="bullet"/>
+      <w:lvlText w:val=""/>
+      <w:lvlJc w:val="left"/>
+      <w:pPr>
+        <w:tabs>
+          <w:tab w:val="num" w:pos="3600"/>
+        </w:tabs>
+        <w:ind w:left="3600" w:hanging="360"/>
+      </w:pPr>
+      <w:rPr>
+        <w:rFonts w:ascii="Wingdings" w:hAnsi="Wingdings" w:hint="default"/>
+        <w:sz w:val="20"/>
+      </w:rPr>
+    </w:lvl>
+    <w:lvl w:ilvl="5" w:tentative="1">
+      <w:start w:val="1"/>
+      <w:numFmt w:val="bullet"/>
+      <w:lvlText w:val=""/>
+      <w:lvlJc w:val="left"/>
+      <w:pPr>
+        <w:tabs>
+          <w:tab w:val="num" w:pos="4320"/>
+        </w:tabs>
+        <w:ind w:left="4320" w:hanging="360"/>
+      </w:pPr>
+      <w:rPr>
+        <w:rFonts w:ascii="Wingdings" w:hAnsi="Wingdings" w:hint="default"/>
+        <w:sz w:val="20"/>
+      </w:rPr>
+    </w:lvl>
+    <w:lvl w:ilvl="6" w:tentative="1">
+      <w:start w:val="1"/>
+      <w:numFmt w:val="bullet"/>
+      <w:lvlText w:val=""/>
+      <w:lvlJc w:val="left"/>
+      <w:pPr>
+        <w:tabs>
+          <w:tab w:val="num" w:pos="5040"/>
+        </w:tabs>
+        <w:ind w:left="5040" w:hanging="360"/>
+      </w:pPr>
+      <w:rPr>
+        <w:rFonts w:ascii="Wingdings" w:hAnsi="Wingdings" w:hint="default"/>
+        <w:sz w:val="20"/>
+      </w:rPr>
+    </w:lvl>
+    <w:lvl w:ilvl="7" w:tentative="1">
+      <w:start w:val="1"/>
+      <w:numFmt w:val="bullet"/>
+      <w:lvlText w:val=""/>
+      <w:lvlJc w:val="left"/>
+      <w:pPr>
+        <w:tabs>
+          <w:tab w:val="num" w:pos="5760"/>
+        </w:tabs>
+        <w:ind w:left="5760" w:hanging="360"/>
+      </w:pPr>
+      <w:rPr>
+        <w:rFonts w:ascii="Wingdings" w:hAnsi="Wingdings" w:hint="default"/>
+        <w:sz w:val="20"/>
+      </w:rPr>
+    </w:lvl>
+    <w:lvl w:ilvl="8" w:tentative="1">
+      <w:start w:val="1"/>
+      <w:numFmt w:val="bullet"/>
+      <w:lvlText w:val=""/>
+      <w:lvlJc w:val="left"/>
+      <w:pPr>
+        <w:tabs>
+          <w:tab w:val="num" w:pos="6480"/>
+        </w:tabs>
+        <w:ind w:left="6480" w:hanging="360"/>
+      </w:pPr>
+      <w:rPr>
+        <w:rFonts w:ascii="Wingdings" w:hAnsi="Wingdings" w:hint="default"/>
+        <w:sz w:val="20"/>
+      </w:rPr>
+    </w:lvl>
+  </w:abstractNum>
+  <w:abstractNum w:abstractNumId="1" w15:restartNumberingAfterBreak="0">
+    <w:nsid w:val="09761AE2"/>
+    <w:multiLevelType w:val="multilevel"/>
+    <w:tmpl w:val="EDAA4E3E"/>
+    <w:lvl w:ilvl="0">
+      <w:start w:val="1"/>
+      <w:numFmt w:val="bullet"/>
+      <w:lvlText w:val=""/>
+      <w:lvlJc w:val="left"/>
+      <w:pPr>
+        <w:tabs>
+          <w:tab w:val="num" w:pos="720"/>
+        </w:tabs>
+        <w:ind w:left="720" w:hanging="360"/>
+      </w:pPr>
+      <w:rPr>
+        <w:rFonts w:ascii="Symbol" w:hAnsi="Symbol" w:hint="default"/>
+        <w:sz w:val="20"/>
+      </w:rPr>
+    </w:lvl>
+    <w:lvl w:ilvl="1" w:tentative="1">
+      <w:start w:val="1"/>
+      <w:numFmt w:val="bullet"/>
+      <w:lvlText w:val="o"/>
+      <w:lvlJc w:val="left"/>
+      <w:pPr>
+        <w:tabs>
+          <w:tab w:val="num" w:pos="1440"/>
+        </w:tabs>
+        <w:ind w:left="1440" w:hanging="360"/>
+      </w:pPr>
+      <w:rPr>
+        <w:rFonts w:ascii="Courier New" w:hAnsi="Courier New" w:hint="default"/>
+        <w:sz w:val="20"/>
+      </w:rPr>
+    </w:lvl>
+    <w:lvl w:ilvl="2" w:tentative="1">
+      <w:start w:val="1"/>
+      <w:numFmt w:val="bullet"/>
+      <w:lvlText w:val=""/>
+      <w:lvlJc w:val="left"/>
+      <w:pPr>
+        <w:tabs>
+          <w:tab w:val="num" w:pos="2160"/>
+        </w:tabs>
+        <w:ind w:left="2160" w:hanging="360"/>
+      </w:pPr>
+      <w:rPr>
+        <w:rFonts w:ascii="Wingdings" w:hAnsi="Wingdings" w:hint="default"/>
+        <w:sz w:val="20"/>
+      </w:rPr>
+    </w:lvl>
+    <w:lvl w:ilvl="3" w:tentative="1">
+      <w:start w:val="1"/>
+      <w:numFmt w:val="bullet"/>
+      <w:lvlText w:val=""/>
+      <w:lvlJc w:val="left"/>
+      <w:pPr>
+        <w:tabs>
+          <w:tab w:val="num" w:pos="2880"/>
+        </w:tabs>
+        <w:ind w:left="2880" w:hanging="360"/>
+      </w:pPr>
+      <w:rPr>
+        <w:rFonts w:ascii="Wingdings" w:hAnsi="Wingdings" w:hint="default"/>
+        <w:sz w:val="20"/>
+      </w:rPr>
+    </w:lvl>
+    <w:lvl w:ilvl="4" w:tentative="1">
+      <w:start w:val="1"/>
+      <w:numFmt w:val="bullet"/>
+      <w:lvlText w:val=""/>
+      <w:lvlJc w:val="left"/>
+      <w:pPr>
+        <w:tabs>
+          <w:tab w:val="num" w:pos="3600"/>
+        </w:tabs>
+        <w:ind w:left="3600" w:hanging="360"/>
+      </w:pPr>
+      <w:rPr>
+        <w:rFonts w:ascii="Wingdings" w:hAnsi="Wingdings" w:hint="default"/>
+        <w:sz w:val="20"/>
+      </w:rPr>
+    </w:lvl>
+    <w:lvl w:ilvl="5" w:tentative="1">
+      <w:start w:val="1"/>
+      <w:numFmt w:val="bullet"/>
+      <w:lvlText w:val=""/>
+      <w:lvlJc w:val="left"/>
+      <w:pPr>
+        <w:tabs>
+          <w:tab w:val="num" w:pos="4320"/>
+        </w:tabs>
+        <w:ind w:left="4320" w:hanging="360"/>
+      </w:pPr>
+      <w:rPr>
+        <w:rFonts w:ascii="Wingdings" w:hAnsi="Wingdings" w:hint="default"/>
+        <w:sz w:val="20"/>
+      </w:rPr>
+    </w:lvl>
+    <w:lvl w:ilvl="6" w:tentative="1">
+      <w:start w:val="1"/>
+      <w:numFmt w:val="bullet"/>
+      <w:lvlText w:val=""/>
+      <w:lvlJc w:val="left"/>
+      <w:pPr>
+        <w:tabs>
+          <w:tab w:val="num" w:pos="5040"/>
+        </w:tabs>
+        <w:ind w:left="5040" w:hanging="360"/>
+      </w:pPr>
+      <w:rPr>
+        <w:rFonts w:ascii="Wingdings" w:hAnsi="Wingdings" w:hint="default"/>
+        <w:sz w:val="20"/>
+      </w:rPr>
+    </w:lvl>
+    <w:lvl w:ilvl="7" w:tentative="1">
+      <w:start w:val="1"/>
+      <w:numFmt w:val="bullet"/>
+      <w:lvlText w:val=""/>
+      <w:lvlJc w:val="left"/>
+      <w:pPr>
+        <w:tabs>
+          <w:tab w:val="num" w:pos="5760"/>
+        </w:tabs>
+        <w:ind w:left="5760" w:hanging="360"/>
+      </w:pPr>
+      <w:rPr>
+        <w:rFonts w:ascii="Wingdings" w:hAnsi="Wingdings" w:hint="default"/>
+        <w:sz w:val="20"/>
+      </w:rPr>
+    </w:lvl>
+    <w:lvl w:ilvl="8" w:tentative="1">
+      <w:start w:val="1"/>
+      <w:numFmt w:val="bullet"/>
+      <w:lvlText w:val=""/>
+      <w:lvlJc w:val="left"/>
+      <w:pPr>
+        <w:tabs>
+          <w:tab w:val="num" w:pos="6480"/>
+        </w:tabs>
+        <w:ind w:left="6480" w:hanging="360"/>
+      </w:pPr>
+      <w:rPr>
+        <w:rFonts w:ascii="Wingdings" w:hAnsi="Wingdings" w:hint="default"/>
+        <w:sz w:val="20"/>
+      </w:rPr>
+    </w:lvl>
+  </w:abstractNum>
+  <w:abstractNum w:abstractNumId="2" w15:restartNumberingAfterBreak="0">
+    <w:nsid w:val="10640CAB"/>
+    <w:multiLevelType w:val="multilevel"/>
+    <w:tmpl w:val="4FA863C6"/>
+    <w:lvl w:ilvl="0">
+      <w:start w:val="1"/>
+      <w:numFmt w:val="bullet"/>
+      <w:lvlText w:val=""/>
+      <w:lvlJc w:val="left"/>
+      <w:pPr>
+        <w:tabs>
+          <w:tab w:val="num" w:pos="720"/>
+        </w:tabs>
+        <w:ind w:left="720" w:hanging="360"/>
+      </w:pPr>
+      <w:rPr>
+        <w:rFonts w:ascii="Symbol" w:hAnsi="Symbol" w:hint="default"/>
+        <w:sz w:val="20"/>
+      </w:rPr>
+    </w:lvl>
+    <w:lvl w:ilvl="1" w:tentative="1">
+      <w:start w:val="1"/>
+      <w:numFmt w:val="bullet"/>
+      <w:lvlText w:val="o"/>
+      <w:lvlJc w:val="left"/>
+      <w:pPr>
+        <w:tabs>
+          <w:tab w:val="num" w:pos="1440"/>
+        </w:tabs>
+        <w:ind w:left="1440" w:hanging="360"/>
+      </w:pPr>
+      <w:rPr>
+        <w:rFonts w:ascii="Courier New" w:hAnsi="Courier New" w:hint="default"/>
+        <w:sz w:val="20"/>
+      </w:rPr>
+    </w:lvl>
+    <w:lvl w:ilvl="2" w:tentative="1">
+      <w:start w:val="1"/>
+      <w:numFmt w:val="bullet"/>
+      <w:lvlText w:val=""/>
+      <w:lvlJc w:val="left"/>
+      <w:pPr>
+        <w:tabs>
+          <w:tab w:val="num" w:pos="2160"/>
+        </w:tabs>
+        <w:ind w:left="2160" w:hanging="360"/>
+      </w:pPr>
+      <w:rPr>
+        <w:rFonts w:ascii="Wingdings" w:hAnsi="Wingdings" w:hint="default"/>
+        <w:sz w:val="20"/>
+      </w:rPr>
+    </w:lvl>
+    <w:lvl w:ilvl="3" w:tentative="1">
+      <w:start w:val="1"/>
+      <w:numFmt w:val="bullet"/>
+      <w:lvlText w:val=""/>
+      <w:lvlJc w:val="left"/>
+      <w:pPr>
+        <w:tabs>
+          <w:tab w:val="num" w:pos="2880"/>
+        </w:tabs>
+        <w:ind w:left="2880" w:hanging="360"/>
+      </w:pPr>
+      <w:rPr>
+        <w:rFonts w:ascii="Wingdings" w:hAnsi="Wingdings" w:hint="default"/>
+        <w:sz w:val="20"/>
+      </w:rPr>
+    </w:lvl>
+    <w:lvl w:ilvl="4" w:tentative="1">
+      <w:start w:val="1"/>
+      <w:numFmt w:val="bullet"/>
+      <w:lvlText w:val=""/>
+      <w:lvlJc w:val="left"/>
+      <w:pPr>
+        <w:tabs>
+          <w:tab w:val="num" w:pos="3600"/>
+        </w:tabs>
+        <w:ind w:left="3600" w:hanging="360"/>
+      </w:pPr>
+      <w:rPr>
+        <w:rFonts w:ascii="Wingdings" w:hAnsi="Wingdings" w:hint="default"/>
+        <w:sz w:val="20"/>
+      </w:rPr>
+    </w:lvl>
+    <w:lvl w:ilvl="5" w:tentative="1">
+      <w:start w:val="1"/>
+      <w:numFmt w:val="bullet"/>
+      <w:lvlText w:val=""/>
+      <w:lvlJc w:val="left"/>
+      <w:pPr>
+        <w:tabs>
+          <w:tab w:val="num" w:pos="4320"/>
+        </w:tabs>
+        <w:ind w:left="4320" w:hanging="360"/>
+      </w:pPr>
+      <w:rPr>
+        <w:rFonts w:ascii="Wingdings" w:hAnsi="Wingdings" w:hint="default"/>
+        <w:sz w:val="20"/>
+      </w:rPr>
+    </w:lvl>
+    <w:lvl w:ilvl="6" w:tentative="1">
+      <w:start w:val="1"/>
+      <w:numFmt w:val="bullet"/>
+      <w:lvlText w:val=""/>
+      <w:lvlJc w:val="left"/>
+      <w:pPr>
+        <w:tabs>
+          <w:tab w:val="num" w:pos="5040"/>
+        </w:tabs>
+        <w:ind w:left="5040" w:hanging="360"/>
+      </w:pPr>
+      <w:rPr>
+        <w:rFonts w:ascii="Wingdings" w:hAnsi="Wingdings" w:hint="default"/>
+        <w:sz w:val="20"/>
+      </w:rPr>
+    </w:lvl>
+    <w:lvl w:ilvl="7" w:tentative="1">
+      <w:start w:val="1"/>
+      <w:numFmt w:val="bullet"/>
+      <w:lvlText w:val=""/>
+      <w:lvlJc w:val="left"/>
+      <w:pPr>
+        <w:tabs>
+          <w:tab w:val="num" w:pos="5760"/>
+        </w:tabs>
+        <w:ind w:left="5760" w:hanging="360"/>
+      </w:pPr>
+      <w:rPr>
+        <w:rFonts w:ascii="Wingdings" w:hAnsi="Wingdings" w:hint="default"/>
+        <w:sz w:val="20"/>
+      </w:rPr>
+    </w:lvl>
+    <w:lvl w:ilvl="8" w:tentative="1">
+      <w:start w:val="1"/>
+      <w:numFmt w:val="bullet"/>
+      <w:lvlText w:val=""/>
+      <w:lvlJc w:val="left"/>
+      <w:pPr>
+        <w:tabs>
+          <w:tab w:val="num" w:pos="6480"/>
+        </w:tabs>
+        <w:ind w:left="6480" w:hanging="360"/>
+      </w:pPr>
+      <w:rPr>
+        <w:rFonts w:ascii="Wingdings" w:hAnsi="Wingdings" w:hint="default"/>
+        <w:sz w:val="20"/>
+      </w:rPr>
+    </w:lvl>
+  </w:abstractNum>
+  <w:abstractNum w:abstractNumId="3" w15:restartNumberingAfterBreak="0">
+    <w:nsid w:val="1DA15F94"/>
+    <w:multiLevelType w:val="multilevel"/>
+    <w:tmpl w:val="D67CCB12"/>
+    <w:lvl w:ilvl="0">
+      <w:start w:val="1"/>
+      <w:numFmt w:val="bullet"/>
+      <w:lvlText w:val=""/>
+      <w:lvlJc w:val="left"/>
+      <w:pPr>
+        <w:tabs>
+          <w:tab w:val="num" w:pos="720"/>
+        </w:tabs>
+        <w:ind w:left="720" w:hanging="360"/>
+      </w:pPr>
+      <w:rPr>
+        <w:rFonts w:ascii="Symbol" w:hAnsi="Symbol" w:hint="default"/>
+        <w:sz w:val="20"/>
+      </w:rPr>
+    </w:lvl>
+    <w:lvl w:ilvl="1" w:tentative="1">
+      <w:start w:val="1"/>
+      <w:numFmt w:val="bullet"/>
+      <w:lvlText w:val="o"/>
+      <w:lvlJc w:val="left"/>
+      <w:pPr>
+        <w:tabs>
+          <w:tab w:val="num" w:pos="1440"/>
+        </w:tabs>
+        <w:ind w:left="1440" w:hanging="360"/>
+      </w:pPr>
+      <w:rPr>
+        <w:rFonts w:ascii="Courier New" w:hAnsi="Courier New" w:hint="default"/>
+        <w:sz w:val="20"/>
+      </w:rPr>
+    </w:lvl>
+    <w:lvl w:ilvl="2" w:tentative="1">
+      <w:start w:val="1"/>
+      <w:numFmt w:val="bullet"/>
+      <w:lvlText w:val=""/>
+      <w:lvlJc w:val="left"/>
+      <w:pPr>
+        <w:tabs>
+          <w:tab w:val="num" w:pos="2160"/>
+        </w:tabs>
+        <w:ind w:left="2160" w:hanging="360"/>
+      </w:pPr>
+      <w:rPr>
+        <w:rFonts w:ascii="Wingdings" w:hAnsi="Wingdings" w:hint="default"/>
+        <w:sz w:val="20"/>
+      </w:rPr>
+    </w:lvl>
+    <w:lvl w:ilvl="3" w:tentative="1">
+      <w:start w:val="1"/>
+      <w:numFmt w:val="bullet"/>
+      <w:lvlText w:val=""/>
+      <w:lvlJc w:val="left"/>
+      <w:pPr>
+        <w:tabs>
+          <w:tab w:val="num" w:pos="2880"/>
+        </w:tabs>
+        <w:ind w:left="2880" w:hanging="360"/>
+      </w:pPr>
+      <w:rPr>
+        <w:rFonts w:ascii="Wingdings" w:hAnsi="Wingdings" w:hint="default"/>
+        <w:sz w:val="20"/>
+      </w:rPr>
+    </w:lvl>
+    <w:lvl w:ilvl="4" w:tentative="1">
+      <w:start w:val="1"/>
+      <w:numFmt w:val="bullet"/>
+      <w:lvlText w:val=""/>
+      <w:lvlJc w:val="left"/>
+      <w:pPr>
+        <w:tabs>
+          <w:tab w:val="num" w:pos="3600"/>
+        </w:tabs>
+        <w:ind w:left="3600" w:hanging="360"/>
+      </w:pPr>
+      <w:rPr>
+        <w:rFonts w:ascii="Wingdings" w:hAnsi="Wingdings" w:hint="default"/>
+        <w:sz w:val="20"/>
+      </w:rPr>
+    </w:lvl>
+    <w:lvl w:ilvl="5" w:tentative="1">
+      <w:start w:val="1"/>
+      <w:numFmt w:val="bullet"/>
+      <w:lvlText w:val=""/>
+      <w:lvlJc w:val="left"/>
+      <w:pPr>
+        <w:tabs>
+          <w:tab w:val="num" w:pos="4320"/>
+        </w:tabs>
+        <w:ind w:left="4320" w:hanging="360"/>
+      </w:pPr>
+      <w:rPr>
+        <w:rFonts w:ascii="Wingdings" w:hAnsi="Wingdings" w:hint="default"/>
+        <w:sz w:val="20"/>
+      </w:rPr>
+    </w:lvl>
+    <w:lvl w:ilvl="6" w:tentative="1">
+      <w:start w:val="1"/>
+      <w:numFmt w:val="bullet"/>
+      <w:lvlText w:val=""/>
+      <w:lvlJc w:val="left"/>
+      <w:pPr>
+        <w:tabs>
+          <w:tab w:val="num" w:pos="5040"/>
+        </w:tabs>
+        <w:ind w:left="5040" w:hanging="360"/>
+      </w:pPr>
+      <w:rPr>
+        <w:rFonts w:ascii="Wingdings" w:hAnsi="Wingdings" w:hint="default"/>
+        <w:sz w:val="20"/>
+      </w:rPr>
+    </w:lvl>
+    <w:lvl w:ilvl="7" w:tentative="1">
+      <w:start w:val="1"/>
+      <w:numFmt w:val="bullet"/>
+      <w:lvlText w:val=""/>
+      <w:lvlJc w:val="left"/>
+      <w:pPr>
+        <w:tabs>
+          <w:tab w:val="num" w:pos="5760"/>
+        </w:tabs>
+        <w:ind w:left="5760" w:hanging="360"/>
+      </w:pPr>
+      <w:rPr>
+        <w:rFonts w:ascii="Wingdings" w:hAnsi="Wingdings" w:hint="default"/>
+        <w:sz w:val="20"/>
+      </w:rPr>
+    </w:lvl>
+    <w:lvl w:ilvl="8" w:tentative="1">
+      <w:start w:val="1"/>
+      <w:numFmt w:val="bullet"/>
+      <w:lvlText w:val=""/>
+      <w:lvlJc w:val="left"/>
+      <w:pPr>
+        <w:tabs>
+          <w:tab w:val="num" w:pos="6480"/>
+        </w:tabs>
+        <w:ind w:left="6480" w:hanging="360"/>
+      </w:pPr>
+      <w:rPr>
+        <w:rFonts w:ascii="Wingdings" w:hAnsi="Wingdings" w:hint="default"/>
+        <w:sz w:val="20"/>
+      </w:rPr>
+    </w:lvl>
+  </w:abstractNum>
+  <w:abstractNum w:abstractNumId="4" w15:restartNumberingAfterBreak="0">
+    <w:nsid w:val="2F5B7D76"/>
+    <w:multiLevelType w:val="multilevel"/>
+    <w:tmpl w:val="B812254C"/>
+    <w:lvl w:ilvl="0">
+      <w:start w:val="1"/>
+      <w:numFmt w:val="bullet"/>
+      <w:lvlText w:val=""/>
+      <w:lvlJc w:val="left"/>
+      <w:pPr>
+        <w:tabs>
+          <w:tab w:val="num" w:pos="720"/>
+        </w:tabs>
+        <w:ind w:left="720" w:hanging="360"/>
+      </w:pPr>
+      <w:rPr>
+        <w:rFonts w:ascii="Symbol" w:hAnsi="Symbol" w:hint="default"/>
+        <w:sz w:val="20"/>
+      </w:rPr>
+    </w:lvl>
+    <w:lvl w:ilvl="1" w:tentative="1">
+      <w:start w:val="1"/>
+      <w:numFmt w:val="bullet"/>
+      <w:lvlText w:val="o"/>
+      <w:lvlJc w:val="left"/>
+      <w:pPr>
+        <w:tabs>
+          <w:tab w:val="num" w:pos="1440"/>
+        </w:tabs>
+        <w:ind w:left="1440" w:hanging="360"/>
+      </w:pPr>
+      <w:rPr>
+        <w:rFonts w:ascii="Courier New" w:hAnsi="Courier New" w:hint="default"/>
+        <w:sz w:val="20"/>
+      </w:rPr>
+    </w:lvl>
+    <w:lvl w:ilvl="2" w:tentative="1">
+      <w:start w:val="1"/>
+      <w:numFmt w:val="bullet"/>
+      <w:lvlText w:val=""/>
+      <w:lvlJc w:val="left"/>
+      <w:pPr>
+        <w:tabs>
+          <w:tab w:val="num" w:pos="2160"/>
+        </w:tabs>
+        <w:ind w:left="2160" w:hanging="360"/>
+      </w:pPr>
+      <w:rPr>
+        <w:rFonts w:ascii="Wingdings" w:hAnsi="Wingdings" w:hint="default"/>
+        <w:sz w:val="20"/>
+      </w:rPr>
+    </w:lvl>
+    <w:lvl w:ilvl="3" w:tentative="1">
+      <w:start w:val="1"/>
+      <w:numFmt w:val="bullet"/>
+      <w:lvlText w:val=""/>
+      <w:lvlJc w:val="left"/>
+      <w:pPr>
+        <w:tabs>
+          <w:tab w:val="num" w:pos="2880"/>
+        </w:tabs>
+        <w:ind w:left="2880" w:hanging="360"/>
+      </w:pPr>
+      <w:rPr>
+        <w:rFonts w:ascii="Wingdings" w:hAnsi="Wingdings" w:hint="default"/>
+        <w:sz w:val="20"/>
+      </w:rPr>
+    </w:lvl>
+    <w:lvl w:ilvl="4" w:tentative="1">
+      <w:start w:val="1"/>
+      <w:numFmt w:val="bullet"/>
+      <w:lvlText w:val=""/>
+      <w:lvlJc w:val="left"/>
+      <w:pPr>
+        <w:tabs>
+          <w:tab w:val="num" w:pos="3600"/>
+        </w:tabs>
+        <w:ind w:left="3600" w:hanging="360"/>
+      </w:pPr>
+      <w:rPr>
+        <w:rFonts w:ascii="Wingdings" w:hAnsi="Wingdings" w:hint="default"/>
+        <w:sz w:val="20"/>
+      </w:rPr>
+    </w:lvl>
+    <w:lvl w:ilvl="5" w:tentative="1">
+      <w:start w:val="1"/>
+      <w:numFmt w:val="bullet"/>
+      <w:lvlText w:val=""/>
+      <w:lvlJc w:val="left"/>
+      <w:pPr>
+        <w:tabs>
+          <w:tab w:val="num" w:pos="4320"/>
+        </w:tabs>
+        <w:ind w:left="4320" w:hanging="360"/>
+      </w:pPr>
+      <w:rPr>
+        <w:rFonts w:ascii="Wingdings" w:hAnsi="Wingdings" w:hint="default"/>
+        <w:sz w:val="20"/>
+      </w:rPr>
+    </w:lvl>
+    <w:lvl w:ilvl="6" w:tentative="1">
+      <w:start w:val="1"/>
+      <w:numFmt w:val="bullet"/>
+      <w:lvlText w:val=""/>
+      <w:lvlJc w:val="left"/>
+      <w:pPr>
+        <w:tabs>
+          <w:tab w:val="num" w:pos="5040"/>
+        </w:tabs>
+        <w:ind w:left="5040" w:hanging="360"/>
+      </w:pPr>
+      <w:rPr>
+        <w:rFonts w:ascii="Wingdings" w:hAnsi="Wingdings" w:hint="default"/>
+        <w:sz w:val="20"/>
+      </w:rPr>
+    </w:lvl>
+    <w:lvl w:ilvl="7" w:tentative="1">
+      <w:start w:val="1"/>
+      <w:numFmt w:val="bullet"/>
+      <w:lvlText w:val=""/>
+      <w:lvlJc w:val="left"/>
+      <w:pPr>
+        <w:tabs>
+          <w:tab w:val="num" w:pos="5760"/>
+        </w:tabs>
+        <w:ind w:left="5760" w:hanging="360"/>
+      </w:pPr>
+      <w:rPr>
+        <w:rFonts w:ascii="Wingdings" w:hAnsi="Wingdings" w:hint="default"/>
+        <w:sz w:val="20"/>
+      </w:rPr>
+    </w:lvl>
+    <w:lvl w:ilvl="8" w:tentative="1">
+      <w:start w:val="1"/>
+      <w:numFmt w:val="bullet"/>
+      <w:lvlText w:val=""/>
+      <w:lvlJc w:val="left"/>
+      <w:pPr>
+        <w:tabs>
+          <w:tab w:val="num" w:pos="6480"/>
+        </w:tabs>
+        <w:ind w:left="6480" w:hanging="360"/>
+      </w:pPr>
+      <w:rPr>
+        <w:rFonts w:ascii="Wingdings" w:hAnsi="Wingdings" w:hint="default"/>
+        <w:sz w:val="20"/>
+      </w:rPr>
+    </w:lvl>
+  </w:abstractNum>
+  <w:abstractNum w:abstractNumId="5" w15:restartNumberingAfterBreak="0">
+    <w:nsid w:val="48AC2507"/>
+    <w:multiLevelType w:val="multilevel"/>
+    <w:tmpl w:val="488C8B62"/>
+    <w:lvl w:ilvl="0">
+      <w:start w:val="1"/>
+      <w:numFmt w:val="decimal"/>
+      <w:lvlText w:val="%1."/>
+      <w:lvlJc w:val="left"/>
+      <w:pPr>
+        <w:tabs>
+          <w:tab w:val="num" w:pos="720"/>
+        </w:tabs>
+        <w:ind w:left="720" w:hanging="360"/>
+      </w:pPr>
+    </w:lvl>
+    <w:lvl w:ilvl="1" w:tentative="1">
+      <w:start w:val="1"/>
+      <w:numFmt w:val="decimal"/>
+      <w:lvlText w:val="%2."/>
+      <w:lvlJc w:val="left"/>
+      <w:pPr>
+        <w:tabs>
+          <w:tab w:val="num" w:pos="1440"/>
+        </w:tabs>
+        <w:ind w:left="1440" w:hanging="360"/>
+      </w:pPr>
+    </w:lvl>
+    <w:lvl w:ilvl="2" w:tentative="1">
+      <w:start w:val="1"/>
+      <w:numFmt w:val="decimal"/>
+      <w:lvlText w:val="%3."/>
+      <w:lvlJc w:val="left"/>
+      <w:pPr>
+        <w:tabs>
+          <w:tab w:val="num" w:pos="2160"/>
+        </w:tabs>
+        <w:ind w:left="2160" w:hanging="360"/>
+      </w:pPr>
+    </w:lvl>
+    <w:lvl w:ilvl="3" w:tentative="1">
+      <w:start w:val="1"/>
+      <w:numFmt w:val="decimal"/>
+      <w:lvlText w:val="%4."/>
+      <w:lvlJc w:val="left"/>
+      <w:pPr>
+        <w:tabs>
+          <w:tab w:val="num" w:pos="2880"/>
+        </w:tabs>
+        <w:ind w:left="2880" w:hanging="360"/>
+      </w:pPr>
+    </w:lvl>
+    <w:lvl w:ilvl="4" w:tentative="1">
+      <w:start w:val="1"/>
+      <w:numFmt w:val="decimal"/>
+      <w:lvlText w:val="%5."/>
+      <w:lvlJc w:val="left"/>
+      <w:pPr>
+        <w:tabs>
+          <w:tab w:val="num" w:pos="3600"/>
+        </w:tabs>
+        <w:ind w:left="3600" w:hanging="360"/>
+      </w:pPr>
+    </w:lvl>
+    <w:lvl w:ilvl="5" w:tentative="1">
+      <w:start w:val="1"/>
+      <w:numFmt w:val="decimal"/>
+      <w:lvlText w:val="%6."/>
+      <w:lvlJc w:val="left"/>
+      <w:pPr>
+        <w:tabs>
+          <w:tab w:val="num" w:pos="4320"/>
+        </w:tabs>
+        <w:ind w:left="4320" w:hanging="360"/>
+      </w:pPr>
+    </w:lvl>
+    <w:lvl w:ilvl="6" w:tentative="1">
+      <w:start w:val="1"/>
+      <w:numFmt w:val="decimal"/>
+      <w:lvlText w:val="%7."/>
+      <w:lvlJc w:val="left"/>
+      <w:pPr>
+        <w:tabs>
+          <w:tab w:val="num" w:pos="5040"/>
+        </w:tabs>
+        <w:ind w:left="5040" w:hanging="360"/>
+      </w:pPr>
+    </w:lvl>
+    <w:lvl w:ilvl="7" w:tentative="1">
+      <w:start w:val="1"/>
+      <w:numFmt w:val="decimal"/>
+      <w:lvlText w:val="%8."/>
+      <w:lvlJc w:val="left"/>
+      <w:pPr>
+        <w:tabs>
+          <w:tab w:val="num" w:pos="5760"/>
+        </w:tabs>
+        <w:ind w:left="5760" w:hanging="360"/>
+      </w:pPr>
+    </w:lvl>
+    <w:lvl w:ilvl="8" w:tentative="1">
+      <w:start w:val="1"/>
+      <w:numFmt w:val="decimal"/>
+      <w:lvlText w:val="%9."/>
+      <w:lvlJc w:val="left"/>
+      <w:pPr>
+        <w:tabs>
+          <w:tab w:val="num" w:pos="6480"/>
+        </w:tabs>
+        <w:ind w:left="6480" w:hanging="360"/>
+      </w:pPr>
+    </w:lvl>
+  </w:abstractNum>
+  <w:abstractNum w:abstractNumId="6" w15:restartNumberingAfterBreak="0">
+    <w:nsid w:val="507F6E3D"/>
+    <w:multiLevelType w:val="multilevel"/>
+    <w:tmpl w:val="C2EC5A9C"/>
+    <w:lvl w:ilvl="0">
+      <w:start w:val="1"/>
+      <w:numFmt w:val="bullet"/>
+      <w:lvlText w:val=""/>
+      <w:lvlJc w:val="left"/>
+      <w:pPr>
+        <w:tabs>
+          <w:tab w:val="num" w:pos="720"/>
+        </w:tabs>
+        <w:ind w:left="720" w:hanging="360"/>
+      </w:pPr>
+      <w:rPr>
+        <w:rFonts w:ascii="Symbol" w:hAnsi="Symbol" w:hint="default"/>
+        <w:sz w:val="20"/>
+      </w:rPr>
+    </w:lvl>
+    <w:lvl w:ilvl="1" w:tentative="1">
+      <w:start w:val="1"/>
+      <w:numFmt w:val="bullet"/>
+      <w:lvlText w:val="o"/>
+      <w:lvlJc w:val="left"/>
+      <w:pPr>
+        <w:tabs>
+          <w:tab w:val="num" w:pos="1440"/>
+        </w:tabs>
+        <w:ind w:left="1440" w:hanging="360"/>
+      </w:pPr>
+      <w:rPr>
+        <w:rFonts w:ascii="Courier New" w:hAnsi="Courier New" w:hint="default"/>
+        <w:sz w:val="20"/>
+      </w:rPr>
+    </w:lvl>
+    <w:lvl w:ilvl="2" w:tentative="1">
+      <w:start w:val="1"/>
+      <w:numFmt w:val="bullet"/>
+      <w:lvlText w:val=""/>
+      <w:lvlJc w:val="left"/>
+      <w:pPr>
+        <w:tabs>
+          <w:tab w:val="num" w:pos="2160"/>
+        </w:tabs>
+        <w:ind w:left="2160" w:hanging="360"/>
+      </w:pPr>
+      <w:rPr>
+        <w:rFonts w:ascii="Wingdings" w:hAnsi="Wingdings" w:hint="default"/>
+        <w:sz w:val="20"/>
+      </w:rPr>
+    </w:lvl>
+    <w:lvl w:ilvl="3" w:tentative="1">
+      <w:start w:val="1"/>
+      <w:numFmt w:val="bullet"/>
+      <w:lvlText w:val=""/>
+      <w:lvlJc w:val="left"/>
+      <w:pPr>
+        <w:tabs>
+          <w:tab w:val="num" w:pos="2880"/>
+        </w:tabs>
+        <w:ind w:left="2880" w:hanging="360"/>
+      </w:pPr>
+      <w:rPr>
+        <w:rFonts w:ascii="Wingdings" w:hAnsi="Wingdings" w:hint="default"/>
+        <w:sz w:val="20"/>
+      </w:rPr>
+    </w:lvl>
+    <w:lvl w:ilvl="4" w:tentative="1">
+      <w:start w:val="1"/>
+      <w:numFmt w:val="bullet"/>
+      <w:lvlText w:val=""/>
+      <w:lvlJc w:val="left"/>
+      <w:pPr>
+        <w:tabs>
+          <w:tab w:val="num" w:pos="3600"/>
+        </w:tabs>
+        <w:ind w:left="3600" w:hanging="360"/>
+      </w:pPr>
+      <w:rPr>
+        <w:rFonts w:ascii="Wingdings" w:hAnsi="Wingdings" w:hint="default"/>
+        <w:sz w:val="20"/>
+      </w:rPr>
+    </w:lvl>
+    <w:lvl w:ilvl="5" w:tentative="1">
+      <w:start w:val="1"/>
+      <w:numFmt w:val="bullet"/>
+      <w:lvlText w:val=""/>
+      <w:lvlJc w:val="left"/>
+      <w:pPr>
+        <w:tabs>
+          <w:tab w:val="num" w:pos="4320"/>
+        </w:tabs>
+        <w:ind w:left="4320" w:hanging="360"/>
+      </w:pPr>
+      <w:rPr>
+        <w:rFonts w:ascii="Wingdings" w:hAnsi="Wingdings" w:hint="default"/>
+        <w:sz w:val="20"/>
+      </w:rPr>
+    </w:lvl>
+    <w:lvl w:ilvl="6" w:tentative="1">
+      <w:start w:val="1"/>
+      <w:numFmt w:val="bullet"/>
+      <w:lvlText w:val=""/>
+      <w:lvlJc w:val="left"/>
+      <w:pPr>
+        <w:tabs>
+          <w:tab w:val="num" w:pos="5040"/>
+        </w:tabs>
+        <w:ind w:left="5040" w:hanging="360"/>
+      </w:pPr>
+      <w:rPr>
+        <w:rFonts w:ascii="Wingdings" w:hAnsi="Wingdings" w:hint="default"/>
+        <w:sz w:val="20"/>
+      </w:rPr>
+    </w:lvl>
+    <w:lvl w:ilvl="7" w:tentative="1">
+      <w:start w:val="1"/>
+      <w:numFmt w:val="bullet"/>
+      <w:lvlText w:val=""/>
+      <w:lvlJc w:val="left"/>
+      <w:pPr>
+        <w:tabs>
+          <w:tab w:val="num" w:pos="5760"/>
+        </w:tabs>
+        <w:ind w:left="5760" w:hanging="360"/>
+      </w:pPr>
+      <w:rPr>
+        <w:rFonts w:ascii="Wingdings" w:hAnsi="Wingdings" w:hint="default"/>
+        <w:sz w:val="20"/>
+      </w:rPr>
+    </w:lvl>
+    <w:lvl w:ilvl="8" w:tentative="1">
+      <w:start w:val="1"/>
+      <w:numFmt w:val="bullet"/>
+      <w:lvlText w:val=""/>
+      <w:lvlJc w:val="left"/>
+      <w:pPr>
+        <w:tabs>
+          <w:tab w:val="num" w:pos="6480"/>
+        </w:tabs>
+        <w:ind w:left="6480" w:hanging="360"/>
+      </w:pPr>
+      <w:rPr>
+        <w:rFonts w:ascii="Wingdings" w:hAnsi="Wingdings" w:hint="default"/>
+        <w:sz w:val="20"/>
+      </w:rPr>
+    </w:lvl>
+  </w:abstractNum>
+  <w:abstractNum w:abstractNumId="7" w15:restartNumberingAfterBreak="0">
+    <w:nsid w:val="542C6EBF"/>
+    <w:multiLevelType w:val="multilevel"/>
+    <w:tmpl w:val="C8448CC0"/>
+    <w:lvl w:ilvl="0">
+      <w:start w:val="1"/>
+      <w:numFmt w:val="bullet"/>
+      <w:lvlText w:val=""/>
+      <w:lvlJc w:val="left"/>
+      <w:pPr>
+        <w:tabs>
+          <w:tab w:val="num" w:pos="720"/>
+        </w:tabs>
+        <w:ind w:left="720" w:hanging="360"/>
+      </w:pPr>
+      <w:rPr>
+        <w:rFonts w:ascii="Symbol" w:hAnsi="Symbol" w:hint="default"/>
+        <w:sz w:val="20"/>
+      </w:rPr>
+    </w:lvl>
+    <w:lvl w:ilvl="1" w:tentative="1">
+      <w:start w:val="1"/>
+      <w:numFmt w:val="bullet"/>
+      <w:lvlText w:val="o"/>
+      <w:lvlJc w:val="left"/>
+      <w:pPr>
+        <w:tabs>
+          <w:tab w:val="num" w:pos="1440"/>
+        </w:tabs>
+        <w:ind w:left="1440" w:hanging="360"/>
+      </w:pPr>
+      <w:rPr>
+        <w:rFonts w:ascii="Courier New" w:hAnsi="Courier New" w:hint="default"/>
+        <w:sz w:val="20"/>
+      </w:rPr>
+    </w:lvl>
+    <w:lvl w:ilvl="2" w:tentative="1">
+      <w:start w:val="1"/>
+      <w:numFmt w:val="bullet"/>
+      <w:lvlText w:val=""/>
+      <w:lvlJc w:val="left"/>
+      <w:pPr>
+        <w:tabs>
+          <w:tab w:val="num" w:pos="2160"/>
+        </w:tabs>
+        <w:ind w:left="2160" w:hanging="360"/>
+      </w:pPr>
+      <w:rPr>
+        <w:rFonts w:ascii="Wingdings" w:hAnsi="Wingdings" w:hint="default"/>
+        <w:sz w:val="20"/>
+      </w:rPr>
+    </w:lvl>
+    <w:lvl w:ilvl="3" w:tentative="1">
+      <w:start w:val="1"/>
+      <w:numFmt w:val="bullet"/>
+      <w:lvlText w:val=""/>
+      <w:lvlJc w:val="left"/>
+      <w:pPr>
+        <w:tabs>
+          <w:tab w:val="num" w:pos="2880"/>
+        </w:tabs>
+        <w:ind w:left="2880" w:hanging="360"/>
+      </w:pPr>
+      <w:rPr>
+        <w:rFonts w:ascii="Wingdings" w:hAnsi="Wingdings" w:hint="default"/>
+        <w:sz w:val="20"/>
+      </w:rPr>
+    </w:lvl>
+    <w:lvl w:ilvl="4" w:tentative="1">
+      <w:start w:val="1"/>
+      <w:numFmt w:val="bullet"/>
+      <w:lvlText w:val=""/>
+      <w:lvlJc w:val="left"/>
+      <w:pPr>
+        <w:tabs>
+          <w:tab w:val="num" w:pos="3600"/>
+        </w:tabs>
+        <w:ind w:left="3600" w:hanging="360"/>
+      </w:pPr>
+      <w:rPr>
+        <w:rFonts w:ascii="Wingdings" w:hAnsi="Wingdings" w:hint="default"/>
+        <w:sz w:val="20"/>
+      </w:rPr>
+    </w:lvl>
+    <w:lvl w:ilvl="5" w:tentative="1">
+      <w:start w:val="1"/>
+      <w:numFmt w:val="bullet"/>
+      <w:lvlText w:val=""/>
+      <w:lvlJc w:val="left"/>
+      <w:pPr>
+        <w:tabs>
+          <w:tab w:val="num" w:pos="4320"/>
+        </w:tabs>
+        <w:ind w:left="4320" w:hanging="360"/>
+      </w:pPr>
+      <w:rPr>
+        <w:rFonts w:ascii="Wingdings" w:hAnsi="Wingdings" w:hint="default"/>
+        <w:sz w:val="20"/>
+      </w:rPr>
+    </w:lvl>
+    <w:lvl w:ilvl="6" w:tentative="1">
+      <w:start w:val="1"/>
+      <w:numFmt w:val="bullet"/>
+      <w:lvlText w:val=""/>
+      <w:lvlJc w:val="left"/>
+      <w:pPr>
+        <w:tabs>
+          <w:tab w:val="num" w:pos="5040"/>
+        </w:tabs>
+        <w:ind w:left="5040" w:hanging="360"/>
+      </w:pPr>
+      <w:rPr>
+        <w:rFonts w:ascii="Wingdings" w:hAnsi="Wingdings" w:hint="default"/>
+        <w:sz w:val="20"/>
+      </w:rPr>
+    </w:lvl>
+    <w:lvl w:ilvl="7" w:tentative="1">
+      <w:start w:val="1"/>
+      <w:numFmt w:val="bullet"/>
+      <w:lvlText w:val=""/>
+      <w:lvlJc w:val="left"/>
+      <w:pPr>
+        <w:tabs>
+          <w:tab w:val="num" w:pos="5760"/>
+        </w:tabs>
+        <w:ind w:left="5760" w:hanging="360"/>
+      </w:pPr>
+      <w:rPr>
+        <w:rFonts w:ascii="Wingdings" w:hAnsi="Wingdings" w:hint="default"/>
+        <w:sz w:val="20"/>
+      </w:rPr>
+    </w:lvl>
+    <w:lvl w:ilvl="8" w:tentative="1">
+      <w:start w:val="1"/>
+      <w:numFmt w:val="bullet"/>
+      <w:lvlText w:val=""/>
+      <w:lvlJc w:val="left"/>
+      <w:pPr>
+        <w:tabs>
+          <w:tab w:val="num" w:pos="6480"/>
+        </w:tabs>
+        <w:ind w:left="6480" w:hanging="360"/>
+      </w:pPr>
+      <w:rPr>
+        <w:rFonts w:ascii="Wingdings" w:hAnsi="Wingdings" w:hint="default"/>
+        <w:sz w:val="20"/>
+      </w:rPr>
+    </w:lvl>
+  </w:abstractNum>
+  <w:abstractNum w:abstractNumId="8" w15:restartNumberingAfterBreak="0">
+    <w:nsid w:val="5BC01828"/>
+    <w:multiLevelType w:val="multilevel"/>
+    <w:tmpl w:val="C89A495A"/>
+    <w:lvl w:ilvl="0">
+      <w:start w:val="1"/>
+      <w:numFmt w:val="bullet"/>
+      <w:lvlText w:val=""/>
+      <w:lvlJc w:val="left"/>
+      <w:pPr>
+        <w:tabs>
+          <w:tab w:val="num" w:pos="720"/>
+        </w:tabs>
+        <w:ind w:left="720" w:hanging="360"/>
+      </w:pPr>
+      <w:rPr>
+        <w:rFonts w:ascii="Symbol" w:hAnsi="Symbol" w:hint="default"/>
+        <w:sz w:val="20"/>
+      </w:rPr>
+    </w:lvl>
+    <w:lvl w:ilvl="1" w:tentative="1">
+      <w:start w:val="1"/>
+      <w:numFmt w:val="bullet"/>
+      <w:lvlText w:val="o"/>
+      <w:lvlJc w:val="left"/>
+      <w:pPr>
+        <w:tabs>
+          <w:tab w:val="num" w:pos="1440"/>
+        </w:tabs>
+        <w:ind w:left="1440" w:hanging="360"/>
+      </w:pPr>
+      <w:rPr>
+        <w:rFonts w:ascii="Courier New" w:hAnsi="Courier New" w:hint="default"/>
+        <w:sz w:val="20"/>
+      </w:rPr>
+    </w:lvl>
+    <w:lvl w:ilvl="2" w:tentative="1">
+      <w:start w:val="1"/>
+      <w:numFmt w:val="bullet"/>
+      <w:lvlText w:val=""/>
+      <w:lvlJc w:val="left"/>
+      <w:pPr>
+        <w:tabs>
+          <w:tab w:val="num" w:pos="2160"/>
+        </w:tabs>
+        <w:ind w:left="2160" w:hanging="360"/>
+      </w:pPr>
+      <w:rPr>
+        <w:rFonts w:ascii="Wingdings" w:hAnsi="Wingdings" w:hint="default"/>
+        <w:sz w:val="20"/>
+      </w:rPr>
+    </w:lvl>
+    <w:lvl w:ilvl="3" w:tentative="1">
+      <w:start w:val="1"/>
+      <w:numFmt w:val="bullet"/>
+      <w:lvlText w:val=""/>
+      <w:lvlJc w:val="left"/>
+      <w:pPr>
+        <w:tabs>
+          <w:tab w:val="num" w:pos="2880"/>
+        </w:tabs>
+        <w:ind w:left="2880" w:hanging="360"/>
+      </w:pPr>
+      <w:rPr>
+        <w:rFonts w:ascii="Wingdings" w:hAnsi="Wingdings" w:hint="default"/>
+        <w:sz w:val="20"/>
+      </w:rPr>
+    </w:lvl>
+    <w:lvl w:ilvl="4" w:tentative="1">
+      <w:start w:val="1"/>
+      <w:numFmt w:val="bullet"/>
+      <w:lvlText w:val=""/>
+      <w:lvlJc w:val="left"/>
+      <w:pPr>
+        <w:tabs>
+          <w:tab w:val="num" w:pos="3600"/>
+        </w:tabs>
+        <w:ind w:left="3600" w:hanging="360"/>
+      </w:pPr>
+      <w:rPr>
+        <w:rFonts w:ascii="Wingdings" w:hAnsi="Wingdings" w:hint="default"/>
+        <w:sz w:val="20"/>
+      </w:rPr>
+    </w:lvl>
+    <w:lvl w:ilvl="5" w:tentative="1">
+      <w:start w:val="1"/>
+      <w:numFmt w:val="bullet"/>
+      <w:lvlText w:val=""/>
+      <w:lvlJc w:val="left"/>
+      <w:pPr>
+        <w:tabs>
+          <w:tab w:val="num" w:pos="4320"/>
+        </w:tabs>
+        <w:ind w:left="4320" w:hanging="360"/>
+      </w:pPr>
+      <w:rPr>
+        <w:rFonts w:ascii="Wingdings" w:hAnsi="Wingdings" w:hint="default"/>
+        <w:sz w:val="20"/>
+      </w:rPr>
+    </w:lvl>
+    <w:lvl w:ilvl="6" w:tentative="1">
+      <w:start w:val="1"/>
+      <w:numFmt w:val="bullet"/>
+      <w:lvlText w:val=""/>
+      <w:lvlJc w:val="left"/>
+      <w:pPr>
+        <w:tabs>
+          <w:tab w:val="num" w:pos="5040"/>
+        </w:tabs>
+        <w:ind w:left="5040" w:hanging="360"/>
+      </w:pPr>
+      <w:rPr>
+        <w:rFonts w:ascii="Wingdings" w:hAnsi="Wingdings" w:hint="default"/>
+        <w:sz w:val="20"/>
+      </w:rPr>
+    </w:lvl>
+    <w:lvl w:ilvl="7" w:tentative="1">
+      <w:start w:val="1"/>
+      <w:numFmt w:val="bullet"/>
+      <w:lvlText w:val=""/>
+      <w:lvlJc w:val="left"/>
+      <w:pPr>
+        <w:tabs>
+          <w:tab w:val="num" w:pos="5760"/>
+        </w:tabs>
+        <w:ind w:left="5760" w:hanging="360"/>
+      </w:pPr>
+      <w:rPr>
+        <w:rFonts w:ascii="Wingdings" w:hAnsi="Wingdings" w:hint="default"/>
+        <w:sz w:val="20"/>
+      </w:rPr>
+    </w:lvl>
+    <w:lvl w:ilvl="8" w:tentative="1">
+      <w:start w:val="1"/>
+      <w:numFmt w:val="bullet"/>
+      <w:lvlText w:val=""/>
+      <w:lvlJc w:val="left"/>
+      <w:pPr>
+        <w:tabs>
+          <w:tab w:val="num" w:pos="6480"/>
+        </w:tabs>
+        <w:ind w:left="6480" w:hanging="360"/>
+      </w:pPr>
+      <w:rPr>
+        <w:rFonts w:ascii="Wingdings" w:hAnsi="Wingdings" w:hint="default"/>
+        <w:sz w:val="20"/>
+      </w:rPr>
+    </w:lvl>
+  </w:abstractNum>
+  <w:abstractNum w:abstractNumId="9" w15:restartNumberingAfterBreak="0">
+    <w:nsid w:val="6D873035"/>
+    <w:multiLevelType w:val="multilevel"/>
+    <w:tmpl w:val="3B5C8AEE"/>
+    <w:lvl w:ilvl="0">
+      <w:start w:val="1"/>
+      <w:numFmt w:val="bullet"/>
+      <w:lvlText w:val=""/>
+      <w:lvlJc w:val="left"/>
+      <w:pPr>
+        <w:tabs>
+          <w:tab w:val="num" w:pos="720"/>
+        </w:tabs>
+        <w:ind w:left="720" w:hanging="360"/>
+      </w:pPr>
+      <w:rPr>
+        <w:rFonts w:ascii="Symbol" w:hAnsi="Symbol" w:hint="default"/>
+        <w:sz w:val="20"/>
+      </w:rPr>
+    </w:lvl>
+    <w:lvl w:ilvl="1" w:tentative="1">
+      <w:start w:val="1"/>
+      <w:numFmt w:val="bullet"/>
+      <w:lvlText w:val="o"/>
+      <w:lvlJc w:val="left"/>
+      <w:pPr>
+        <w:tabs>
+          <w:tab w:val="num" w:pos="1440"/>
+        </w:tabs>
+        <w:ind w:left="1440" w:hanging="360"/>
+      </w:pPr>
+      <w:rPr>
+        <w:rFonts w:ascii="Courier New" w:hAnsi="Courier New" w:hint="default"/>
+        <w:sz w:val="20"/>
+      </w:rPr>
+    </w:lvl>
+    <w:lvl w:ilvl="2" w:tentative="1">
+      <w:start w:val="1"/>
+      <w:numFmt w:val="bullet"/>
+      <w:lvlText w:val=""/>
+      <w:lvlJc w:val="left"/>
+      <w:pPr>
+        <w:tabs>
+          <w:tab w:val="num" w:pos="2160"/>
+        </w:tabs>
+        <w:ind w:left="2160" w:hanging="360"/>
+      </w:pPr>
+      <w:rPr>
+        <w:rFonts w:ascii="Wingdings" w:hAnsi="Wingdings" w:hint="default"/>
+        <w:sz w:val="20"/>
+      </w:rPr>
+    </w:lvl>
+    <w:lvl w:ilvl="3" w:tentative="1">
+      <w:start w:val="1"/>
+      <w:numFmt w:val="bullet"/>
+      <w:lvlText w:val=""/>
+      <w:lvlJc w:val="left"/>
+      <w:pPr>
+        <w:tabs>
+          <w:tab w:val="num" w:pos="2880"/>
+        </w:tabs>
+        <w:ind w:left="2880" w:hanging="360"/>
+      </w:pPr>
+      <w:rPr>
+        <w:rFonts w:ascii="Wingdings" w:hAnsi="Wingdings" w:hint="default"/>
+        <w:sz w:val="20"/>
+      </w:rPr>
+    </w:lvl>
+    <w:lvl w:ilvl="4" w:tentative="1">
+      <w:start w:val="1"/>
+      <w:numFmt w:val="bullet"/>
+      <w:lvlText w:val=""/>
+      <w:lvlJc w:val="left"/>
+      <w:pPr>
+        <w:tabs>
+          <w:tab w:val="num" w:pos="3600"/>
+        </w:tabs>
+        <w:ind w:left="3600" w:hanging="360"/>
+      </w:pPr>
+      <w:rPr>
+        <w:rFonts w:ascii="Wingdings" w:hAnsi="Wingdings" w:hint="default"/>
+        <w:sz w:val="20"/>
+      </w:rPr>
+    </w:lvl>
+    <w:lvl w:ilvl="5" w:tentative="1">
+      <w:start w:val="1"/>
+      <w:numFmt w:val="bullet"/>
+      <w:lvlText w:val=""/>
+      <w:lvlJc w:val="left"/>
+      <w:pPr>
+        <w:tabs>
+          <w:tab w:val="num" w:pos="4320"/>
+        </w:tabs>
+        <w:ind w:left="4320" w:hanging="360"/>
+      </w:pPr>
+      <w:rPr>
+        <w:rFonts w:ascii="Wingdings" w:hAnsi="Wingdings" w:hint="default"/>
+        <w:sz w:val="20"/>
+      </w:rPr>
+    </w:lvl>
+    <w:lvl w:ilvl="6" w:tentative="1">
+      <w:start w:val="1"/>
+      <w:numFmt w:val="bullet"/>
+      <w:lvlText w:val=""/>
+      <w:lvlJc w:val="left"/>
+      <w:pPr>
+        <w:tabs>
+          <w:tab w:val="num" w:pos="5040"/>
+        </w:tabs>
+        <w:ind w:left="5040" w:hanging="360"/>
+      </w:pPr>
+      <w:rPr>
+        <w:rFonts w:ascii="Wingdings" w:hAnsi="Wingdings" w:hint="default"/>
+        <w:sz w:val="20"/>
+      </w:rPr>
+    </w:lvl>
+    <w:lvl w:ilvl="7" w:tentative="1">
+      <w:start w:val="1"/>
+      <w:numFmt w:val="bullet"/>
+      <w:lvlText w:val=""/>
+      <w:lvlJc w:val="left"/>
+      <w:pPr>
+        <w:tabs>
+          <w:tab w:val="num" w:pos="5760"/>
+        </w:tabs>
+        <w:ind w:left="5760" w:hanging="360"/>
+      </w:pPr>
+      <w:rPr>
+        <w:rFonts w:ascii="Wingdings" w:hAnsi="Wingdings" w:hint="default"/>
+        <w:sz w:val="20"/>
+      </w:rPr>
+    </w:lvl>
+    <w:lvl w:ilvl="8" w:tentative="1">
+      <w:start w:val="1"/>
+      <w:numFmt w:val="bullet"/>
+      <w:lvlText w:val=""/>
+      <w:lvlJc w:val="left"/>
+      <w:pPr>
+        <w:tabs>
+          <w:tab w:val="num" w:pos="6480"/>
+        </w:tabs>
+        <w:ind w:left="6480" w:hanging="360"/>
+      </w:pPr>
+      <w:rPr>
+        <w:rFonts w:ascii="Wingdings" w:hAnsi="Wingdings" w:hint="default"/>
+        <w:sz w:val="20"/>
+      </w:rPr>
+    </w:lvl>
+  </w:abstractNum>
+  <w:abstractNum w:abstractNumId="10" w15:restartNumberingAfterBreak="0">
+    <w:nsid w:val="75674C7B"/>
+    <w:multiLevelType w:val="multilevel"/>
+    <w:tmpl w:val="A692B780"/>
+    <w:lvl w:ilvl="0">
+      <w:start w:val="1"/>
+      <w:numFmt w:val="bullet"/>
+      <w:lvlText w:val=""/>
+      <w:lvlJc w:val="left"/>
+      <w:pPr>
+        <w:tabs>
+          <w:tab w:val="num" w:pos="720"/>
+        </w:tabs>
+        <w:ind w:left="720" w:hanging="360"/>
+      </w:pPr>
+      <w:rPr>
+        <w:rFonts w:ascii="Symbol" w:hAnsi="Symbol" w:hint="default"/>
+        <w:sz w:val="20"/>
+      </w:rPr>
+    </w:lvl>
+    <w:lvl w:ilvl="1" w:tentative="1">
+      <w:start w:val="1"/>
+      <w:numFmt w:val="bullet"/>
+      <w:lvlText w:val="o"/>
+      <w:lvlJc w:val="left"/>
+      <w:pPr>
+        <w:tabs>
+          <w:tab w:val="num" w:pos="1440"/>
+        </w:tabs>
+        <w:ind w:left="1440" w:hanging="360"/>
+      </w:pPr>
+      <w:rPr>
+        <w:rFonts w:ascii="Courier New" w:hAnsi="Courier New" w:hint="default"/>
+        <w:sz w:val="20"/>
+      </w:rPr>
+    </w:lvl>
+    <w:lvl w:ilvl="2" w:tentative="1">
+      <w:start w:val="1"/>
+      <w:numFmt w:val="bullet"/>
+      <w:lvlText w:val=""/>
+      <w:lvlJc w:val="left"/>
+      <w:pPr>
+        <w:tabs>
+          <w:tab w:val="num" w:pos="2160"/>
+        </w:tabs>
+        <w:ind w:left="2160" w:hanging="360"/>
+      </w:pPr>
+      <w:rPr>
+        <w:rFonts w:ascii="Wingdings" w:hAnsi="Wingdings" w:hint="default"/>
+        <w:sz w:val="20"/>
+      </w:rPr>
+    </w:lvl>
+    <w:lvl w:ilvl="3" w:tentative="1">
+      <w:start w:val="1"/>
+      <w:numFmt w:val="bullet"/>
+      <w:lvlText w:val=""/>
+      <w:lvlJc w:val="left"/>
+      <w:pPr>
+        <w:tabs>
+          <w:tab w:val="num" w:pos="2880"/>
+        </w:tabs>
+        <w:ind w:left="2880" w:hanging="360"/>
+      </w:pPr>
+      <w:rPr>
+        <w:rFonts w:ascii="Wingdings" w:hAnsi="Wingdings" w:hint="default"/>
+        <w:sz w:val="20"/>
+      </w:rPr>
+    </w:lvl>
+    <w:lvl w:ilvl="4" w:tentative="1">
+      <w:start w:val="1"/>
+      <w:numFmt w:val="bullet"/>
+      <w:lvlText w:val=""/>
+      <w:lvlJc w:val="left"/>
+      <w:pPr>
+        <w:tabs>
+          <w:tab w:val="num" w:pos="3600"/>
+        </w:tabs>
+        <w:ind w:left="3600" w:hanging="360"/>
+      </w:pPr>
+      <w:rPr>
+        <w:rFonts w:ascii="Wingdings" w:hAnsi="Wingdings" w:hint="default"/>
+        <w:sz w:val="20"/>
+      </w:rPr>
+    </w:lvl>
+    <w:lvl w:ilvl="5" w:tentative="1">
+      <w:start w:val="1"/>
+      <w:numFmt w:val="bullet"/>
+      <w:lvlText w:val=""/>
+      <w:lvlJc w:val="left"/>
+      <w:pPr>
+        <w:tabs>
+          <w:tab w:val="num" w:pos="4320"/>
+        </w:tabs>
+        <w:ind w:left="4320" w:hanging="360"/>
+      </w:pPr>
+      <w:rPr>
+        <w:rFonts w:ascii="Wingdings" w:hAnsi="Wingdings" w:hint="default"/>
+        <w:sz w:val="20"/>
+      </w:rPr>
+    </w:lvl>
+    <w:lvl w:ilvl="6" w:tentative="1">
+      <w:start w:val="1"/>
+      <w:numFmt w:val="bullet"/>
+      <w:lvlText w:val=""/>
+      <w:lvlJc w:val="left"/>
+      <w:pPr>
+        <w:tabs>
+          <w:tab w:val="num" w:pos="5040"/>
+        </w:tabs>
+        <w:ind w:left="5040" w:hanging="360"/>
+      </w:pPr>
+      <w:rPr>
+        <w:rFonts w:ascii="Wingdings" w:hAnsi="Wingdings" w:hint="default"/>
+        <w:sz w:val="20"/>
+      </w:rPr>
+    </w:lvl>
+    <w:lvl w:ilvl="7" w:tentative="1">
+      <w:start w:val="1"/>
+      <w:numFmt w:val="bullet"/>
+      <w:lvlText w:val=""/>
+      <w:lvlJc w:val="left"/>
+      <w:pPr>
+        <w:tabs>
+          <w:tab w:val="num" w:pos="5760"/>
+        </w:tabs>
+        <w:ind w:left="5760" w:hanging="360"/>
+      </w:pPr>
+      <w:rPr>
+        <w:rFonts w:ascii="Wingdings" w:hAnsi="Wingdings" w:hint="default"/>
+        <w:sz w:val="20"/>
+      </w:rPr>
+    </w:lvl>
+    <w:lvl w:ilvl="8" w:tentative="1">
+      <w:start w:val="1"/>
+      <w:numFmt w:val="bullet"/>
+      <w:lvlText w:val=""/>
+      <w:lvlJc w:val="left"/>
+      <w:pPr>
+        <w:tabs>
+          <w:tab w:val="num" w:pos="6480"/>
+        </w:tabs>
+        <w:ind w:left="6480" w:hanging="360"/>
+      </w:pPr>
+      <w:rPr>
+        <w:rFonts w:ascii="Wingdings" w:hAnsi="Wingdings" w:hint="default"/>
+        <w:sz w:val="20"/>
+      </w:rPr>
+    </w:lvl>
+  </w:abstractNum>
+  <w:abstractNum w:abstractNumId="11" w15:restartNumberingAfterBreak="0">
+    <w:nsid w:val="7AA4477C"/>
+    <w:multiLevelType w:val="multilevel"/>
+    <w:tmpl w:val="4C1082EA"/>
+    <w:lvl w:ilvl="0">
+      <w:start w:val="1"/>
+      <w:numFmt w:val="bullet"/>
+      <w:lvlText w:val=""/>
+      <w:lvlJc w:val="left"/>
+      <w:pPr>
+        <w:tabs>
+          <w:tab w:val="num" w:pos="720"/>
+        </w:tabs>
+        <w:ind w:left="720" w:hanging="360"/>
+      </w:pPr>
+      <w:rPr>
+        <w:rFonts w:ascii="Symbol" w:hAnsi="Symbol" w:hint="default"/>
+        <w:sz w:val="20"/>
+      </w:rPr>
+    </w:lvl>
+    <w:lvl w:ilvl="1" w:tentative="1">
+      <w:start w:val="1"/>
+      <w:numFmt w:val="bullet"/>
+      <w:lvlText w:val="o"/>
+      <w:lvlJc w:val="left"/>
+      <w:pPr>
+        <w:tabs>
+          <w:tab w:val="num" w:pos="1440"/>
+        </w:tabs>
+        <w:ind w:left="1440" w:hanging="360"/>
+      </w:pPr>
+      <w:rPr>
+        <w:rFonts w:ascii="Courier New" w:hAnsi="Courier New" w:hint="default"/>
+        <w:sz w:val="20"/>
+      </w:rPr>
+    </w:lvl>
+    <w:lvl w:ilvl="2" w:tentative="1">
+      <w:start w:val="1"/>
+      <w:numFmt w:val="bullet"/>
+      <w:lvlText w:val=""/>
+      <w:lvlJc w:val="left"/>
+      <w:pPr>
+        <w:tabs>
+          <w:tab w:val="num" w:pos="2160"/>
+        </w:tabs>
+        <w:ind w:left="2160" w:hanging="360"/>
+      </w:pPr>
+      <w:rPr>
+        <w:rFonts w:ascii="Wingdings" w:hAnsi="Wingdings" w:hint="default"/>
+        <w:sz w:val="20"/>
+      </w:rPr>
+    </w:lvl>
+    <w:lvl w:ilvl="3" w:tentative="1">
+      <w:start w:val="1"/>
+      <w:numFmt w:val="bullet"/>
+      <w:lvlText w:val=""/>
+      <w:lvlJc w:val="left"/>
+      <w:pPr>
+        <w:tabs>
+          <w:tab w:val="num" w:pos="2880"/>
+        </w:tabs>
+        <w:ind w:left="2880" w:hanging="360"/>
+      </w:pPr>
+      <w:rPr>
+        <w:rFonts w:ascii="Wingdings" w:hAnsi="Wingdings" w:hint="default"/>
+        <w:sz w:val="20"/>
+      </w:rPr>
+    </w:lvl>
+    <w:lvl w:ilvl="4" w:tentative="1">
+      <w:start w:val="1"/>
+      <w:numFmt w:val="bullet"/>
+      <w:lvlText w:val=""/>
+      <w:lvlJc w:val="left"/>
+      <w:pPr>
+        <w:tabs>
+          <w:tab w:val="num" w:pos="3600"/>
+        </w:tabs>
+        <w:ind w:left="3600" w:hanging="360"/>
+      </w:pPr>
+      <w:rPr>
+        <w:rFonts w:ascii="Wingdings" w:hAnsi="Wingdings" w:hint="default"/>
+        <w:sz w:val="20"/>
+      </w:rPr>
+    </w:lvl>
+    <w:lvl w:ilvl="5" w:tentative="1">
+      <w:start w:val="1"/>
+      <w:numFmt w:val="bullet"/>
+      <w:lvlText w:val=""/>
+      <w:lvlJc w:val="left"/>
+      <w:pPr>
+        <w:tabs>
+          <w:tab w:val="num" w:pos="4320"/>
+        </w:tabs>
+        <w:ind w:left="4320" w:hanging="360"/>
+      </w:pPr>
+      <w:rPr>
+        <w:rFonts w:ascii="Wingdings" w:hAnsi="Wingdings" w:hint="default"/>
+        <w:sz w:val="20"/>
+      </w:rPr>
+    </w:lvl>
+    <w:lvl w:ilvl="6" w:tentative="1">
+      <w:start w:val="1"/>
+      <w:numFmt w:val="bullet"/>
+      <w:lvlText w:val=""/>
+      <w:lvlJc w:val="left"/>
+      <w:pPr>
+        <w:tabs>
+          <w:tab w:val="num" w:pos="5040"/>
+        </w:tabs>
+        <w:ind w:left="5040" w:hanging="360"/>
+      </w:pPr>
+      <w:rPr>
+        <w:rFonts w:ascii="Wingdings" w:hAnsi="Wingdings" w:hint="default"/>
+        <w:sz w:val="20"/>
+      </w:rPr>
+    </w:lvl>
+    <w:lvl w:ilvl="7" w:tentative="1">
+      <w:start w:val="1"/>
+      <w:numFmt w:val="bullet"/>
+      <w:lvlText w:val=""/>
+      <w:lvlJc w:val="left"/>
+      <w:pPr>
+        <w:tabs>
+          <w:tab w:val="num" w:pos="5760"/>
+        </w:tabs>
+        <w:ind w:left="5760" w:hanging="360"/>
+      </w:pPr>
+      <w:rPr>
+        <w:rFonts w:ascii="Wingdings" w:hAnsi="Wingdings" w:hint="default"/>
+        <w:sz w:val="20"/>
+      </w:rPr>
+    </w:lvl>
+    <w:lvl w:ilvl="8" w:tentative="1">
+      <w:start w:val="1"/>
+      <w:numFmt w:val="bullet"/>
+      <w:lvlText w:val=""/>
+      <w:lvlJc w:val="left"/>
+      <w:pPr>
+        <w:tabs>
+          <w:tab w:val="num" w:pos="6480"/>
+        </w:tabs>
+        <w:ind w:left="6480" w:hanging="360"/>
+      </w:pPr>
+      <w:rPr>
+        <w:rFonts w:ascii="Wingdings" w:hAnsi="Wingdings" w:hint="default"/>
+        <w:sz w:val="20"/>
+      </w:rPr>
+    </w:lvl>
+  </w:abstractNum>
+  <w:num w:numId="1" w16cid:durableId="506482713">
+    <w:abstractNumId w:val="4"/>
+  </w:num>
+  <w:num w:numId="2" w16cid:durableId="1677807440">
+    <w:abstractNumId w:val="0"/>
+  </w:num>
+  <w:num w:numId="3" w16cid:durableId="808549302">
+    <w:abstractNumId w:val="10"/>
+  </w:num>
+  <w:num w:numId="4" w16cid:durableId="744306370">
+    <w:abstractNumId w:val="8"/>
+  </w:num>
+  <w:num w:numId="5" w16cid:durableId="709958215">
+    <w:abstractNumId w:val="9"/>
+  </w:num>
+  <w:num w:numId="6" w16cid:durableId="1489903437">
+    <w:abstractNumId w:val="5"/>
+  </w:num>
+  <w:num w:numId="7" w16cid:durableId="2048985931">
+    <w:abstractNumId w:val="1"/>
+  </w:num>
+  <w:num w:numId="8" w16cid:durableId="2055495229">
+    <w:abstractNumId w:val="11"/>
+  </w:num>
+  <w:num w:numId="9" w16cid:durableId="2128620314">
+    <w:abstractNumId w:val="3"/>
+  </w:num>
+  <w:num w:numId="10" w16cid:durableId="1051807877">
+    <w:abstractNumId w:val="6"/>
+  </w:num>
+  <w:num w:numId="11" w16cid:durableId="360252245">
+    <w:abstractNumId w:val="7"/>
+  </w:num>
+  <w:num w:numId="12" w16cid:durableId="540092858">
+    <w:abstractNumId w:val="2"/>
+  </w:num>
+</w:numbering>
 </file>
 
 <file path=word/styles.xml><?xml version="1.0" encoding="utf-8"?>

</xml_diff>